<commit_message>
docs: document live Proxmox deployment
</commit_message>
<xml_diff>
--- a/DST_Airlines_Documentation.docx
+++ b/DST_Airlines_Documentation.docx
@@ -57,7 +57,7 @@
           <w:color w:val="475569"/>
           <w:sz w:val="20"/>
         </w:rPr>
-        <w:t>Updated from the main branch working tree | 30 July 2026</w:t>
+        <w:t>Updated from verified main deployment | 31 July 2026</w:t>
       </w:r>
     </w:p>
     <w:p>
@@ -84,7 +84,7 @@
           <w:color w:val="475569"/>
           <w:sz w:val="20"/>
         </w:rPr>
-        <w:t>The previous pipeline passed tests, image publication, Kind deployment, and smoke tests. New Terraform and Trivy stages await the next push.</w:t>
+        <w:t>The latest main pipeline passed 81 tests, Terraform validation, GHCR publication, Trivy gates, temporary Kind deployment, and smoke tests.</w:t>
       </w:r>
     </w:p>
     <w:p>
@@ -1123,7 +1123,7 @@
     </w:p>
     <w:p>
       <w:r>
-        <w:t>The strongest completed area is Step 5, CI/CD. GitHub Actions runs 81 tests, builds API and dashboard images, publishes immutable SHA tags to GHCR, deploys the stack to a temporary Kind cluster, and smoke-tests the web services. The latest verified main run completed successfully. Terraform validation and Trivy image gates have now been added for the next run.</w:t>
+        <w:t>The strongest completed area is Step 5, CI/CD. GitHub Actions runs 81 tests, validates Terraform, builds and scans API/dashboard images, publishes immutable SHA tags to GHCR, deploys to a temporary Kind cluster, and smoke-tests both web services. The latest verified main run completed the full pipeline successfully.</w:t>
       </w:r>
     </w:p>
     <w:tbl>
@@ -1170,7 +1170,7 @@
               <w:rPr>
                 <w:sz w:val="20"/>
               </w:rPr>
-              <w:t>The Kind deployment is temporary and exists only during the workflow. The repository does not yet deploy automatically to a long-running development or production cluster.</w:t>
+              <w:t>Kind is temporary Kubernetes validation inside CI and disappears after the workflow. The separately deployed Proxmox environment is persistent and serves the live dashboard/API; CI does not currently promote releases to it automatically.</w:t>
             </w:r>
           </w:p>
         </w:tc>
@@ -1183,7 +1183,7 @@
     </w:p>
     <w:p>
       <w:r>
-        <w:t>Repository-level security and configuration issues were corrected: runtime secret files are ignored, password defaults were removed, Terraform uses local Docker or SSH, Grafana provisioning was repaired, and repeatable deployment and backup scripts were added. Credential rotation and a persistent deployment target remain external actions.</w:t>
+        <w:t>Repository-level configuration was clarified: committed credentials are classroom/demo defaults, production replacements must be protected, Terraform supports Docker over SSH, Grafana provisioning was repaired, and deployment/backup scripts were added. A persistent Proxmox deployment is now live; production hardening remains.</w:t>
       </w:r>
     </w:p>
     <w:p>
@@ -1515,7 +1515,7 @@
                 <w:rFonts w:ascii="Calibri" w:hAnsi="Calibri"/>
                 <w:sz w:val="18"/>
               </w:rPr>
-              <w:t>Configured; persistent hosted environments pending.</w:t>
+              <w:t>Configured; persistent Proxmox demonstration verified live.</w:t>
             </w:r>
           </w:p>
         </w:tc>
@@ -1907,7 +1907,7 @@
                 <w:rFonts w:ascii="Calibri" w:hAnsi="Calibri"/>
                 <w:sz w:val="18"/>
               </w:rPr>
-              <w:t>Local or Proxmox Docker guest through SSH; apply pending.</w:t>
+              <w:t>Proxmox Docker guest is live; Terraform supports management over SSH.</w:t>
             </w:r>
           </w:p>
         </w:tc>
@@ -3422,7 +3422,7 @@
               <w:rPr>
                 <w:sz w:val="20"/>
               </w:rPr>
-              <w:t>Development, production, and Kubernetes example files list every required variable. Populated copies are ignored and must remain outside Git.</w:t>
+              <w:t>Committed values are classroom/demo defaults. Production replacements must be unique and stored in protected GitHub/server/Kubernetes secret configuration, not committed to Git.</w:t>
             </w:r>
           </w:p>
         </w:tc>
@@ -3817,7 +3817,7 @@
     </w:p>
     <w:p>
       <w:r>
-        <w:t>The latest main GitHub Actions run passed the complete test job. Local execution was not repeated for this report because Docker Desktop was not running; GitHub provides the verified result.</w:t>
+        <w:t>The latest main GitHub Actions run passed all 81 tests and the complete CI/CD workflow. GitHub provides the verified test, Terraform, image, security, Kind deployment, and smoke-test evidence.</w:t>
       </w:r>
     </w:p>
     <w:p>
@@ -4664,7 +4664,7 @@
                 <w:rFonts w:ascii="Calibri" w:hAnsi="Calibri"/>
                 <w:sz w:val="18"/>
               </w:rPr>
-              <w:t>No</w:t>
+              <w:t>No - Proxmox is deployed separately</w:t>
             </w:r>
           </w:p>
         </w:tc>
@@ -4719,7 +4719,7 @@
               <w:rPr>
                 <w:sz w:val="20"/>
               </w:rPr>
-              <w:t>Add a persistent development target, a separate production target, environment-specific configuration, protected GitHub Environments, and required reviewer approval before production.</w:t>
+              <w:t>Persistent demonstration: Proxmox now hosts the live dashboard and API. Still required for production: HTTPS, protected GitHub Environments, environment-specific configuration, and reviewer approval.</w:t>
             </w:r>
           </w:p>
         </w:tc>
@@ -5280,7 +5280,7 @@
         <w:pStyle w:val="ListBullet"/>
       </w:pPr>
       <w:r>
-        <w:t>Kind is used in CI because it is fast and disposable on a GitHub-hosted runner.</w:t>
+        <w:t>Kind is used in CI because it is fast and disposable; it validates Kubernetes deployment and is deleted when the workflow finishes.</w:t>
       </w:r>
     </w:p>
     <w:p>
@@ -5373,7 +5373,7 @@
     </w:p>
     <w:p>
       <w:r>
-        <w:t>Terraform uses the kreuzwerker/docker provider. It defines a Docker network, three volumes, PostgreSQL, MongoDB, Neo4j, API, and dashboard containers. Application image references are immutable input variables.</w:t>
+        <w:t>Terraform uses the kreuzwerker/docker provider to manage the Docker network, volumes, databases, API, and dashboard. The persistent Proxmox-hosted environment is live and was verified on 31 July 2026: dashboard HTTP 200 on port 8050 and API HTTP 200 on port 8000.</w:t>
       </w:r>
     </w:p>
     <w:p>
@@ -5381,7 +5381,7 @@
         <w:pStyle w:val="ListBullet"/>
       </w:pPr>
       <w:r>
-        <w:t>Terraform does not provision a VM or Kubernetes cluster.</w:t>
+        <w:t>Terraform manages Docker inside the Proxmox guest; it does not provision the Proxmox host, VM/LXC, or a Kubernetes cluster.</w:t>
       </w:r>
     </w:p>
     <w:p>
@@ -5452,7 +5452,7 @@
               <w:rPr>
                 <w:sz w:val="20"/>
               </w:rPr>
-              <w:t>Proxmox is a hosting platform, not a numbered requirement. A Docker VM or LXC hosted there contributes to Step 2 when it is a persistent environment and Step 6 when Terraform manages it. It contributes to Step 5 only after CI/CD deploys to it. It does not replace Kubernetes Step 4.</w:t>
+              <w:t>Proxmox now provides the persistent Docker host for the live demonstration. It supports Step 2 as a hosted environment and Step 6 through Terraform-over-SSH. Kind still covers Kubernetes validation for Step 4, and CI/CD does not yet deploy automatically to Proxmox.</w:t>
             </w:r>
           </w:p>
         </w:tc>
@@ -5966,7 +5966,7 @@
     </w:p>
     <w:p>
       <w:r>
-        <w:t>The repository contains a Kubernetes Secret template, excludes environment files from Docker build contexts, uses GITHUB_TOKEN for GHCR, scans images in CI, and enables Dependabot. Current files no longer contain the previously identified password defaults.</w:t>
+        <w:t>The repository contains a Kubernetes Secret template, excludes environment files from Docker build contexts, uses GITHUB_TOKEN for GHCR, scans images in CI, and enables Dependabot. Python modules no longer contain password defaults; committed environment values are classroom/demo credentials that must be replaced for production.</w:t>
       </w:r>
     </w:p>
     <w:tbl>
@@ -6114,7 +6114,7 @@
                 <w:rFonts w:ascii="Calibri" w:hAnsi="Calibri"/>
                 <w:sz w:val="18"/>
               </w:rPr>
-              <w:t>Removed and ignored</w:t>
+              <w:t>Classroom/demo defaults committed</w:t>
             </w:r>
           </w:p>
         </w:tc>
@@ -6138,7 +6138,7 @@
                 <w:rFonts w:ascii="Calibri" w:hAnsi="Calibri"/>
                 <w:sz w:val="18"/>
               </w:rPr>
-              <w:t>Rotate exposed historical values; coordinate history purge.</w:t>
+              <w:t>Replace with unique protected values before production.</w:t>
             </w:r>
           </w:p>
         </w:tc>
@@ -6360,7 +6360,7 @@
                 <w:rFonts w:ascii="Calibri" w:hAnsi="Calibri"/>
                 <w:sz w:val="18"/>
               </w:rPr>
-              <w:t>Review the next CI result and update dependencies.</w:t>
+              <w:t>Review Dependabot updates and recurring Trivy results.</w:t>
             </w:r>
           </w:p>
         </w:tc>
@@ -6484,7 +6484,7 @@
                 <w:rFonts w:ascii="Calibri" w:hAnsi="Calibri"/>
                 <w:sz w:val="18"/>
               </w:rPr>
-              <w:t>Not implemented</w:t>
+              <w:t>Live Proxmox demo over HTTP</w:t>
             </w:r>
           </w:p>
         </w:tc>
@@ -6508,7 +6508,7 @@
                 <w:rFonts w:ascii="Calibri" w:hAnsi="Calibri"/>
                 <w:sz w:val="18"/>
               </w:rPr>
-              <w:t>Add HTTPS, firewall, NetworkPolicy, and RBAC.</w:t>
+              <w:t>Add HTTPS, firewall review, NetworkPolicy, and RBAC.</w:t>
             </w:r>
           </w:p>
         </w:tc>
@@ -6552,7 +6552,7 @@
                 <w:b/>
                 <w:color w:val="0F172A"/>
               </w:rPr>
-              <w:t>Historical secret warning</w:t>
+              <w:t>Credential warning</w:t>
             </w:r>
           </w:p>
           <w:p>
@@ -6563,7 +6563,7 @@
               <w:rPr>
                 <w:sz w:val="20"/>
               </w:rPr>
-              <w:t>The current files are cleaned, but credentials from earlier commits remain exposed until rotated. History rewriting requires coordination with every collaborator.</w:t>
+              <w:t>Every committed credential must be treated as public. Demo values are acceptable for coursework only; production must use unique protected secrets and immediate rotation if a real service ever reused a committed value.</w:t>
             </w:r>
           </w:p>
         </w:tc>
@@ -7278,8 +7278,34 @@
     </w:p>
     <w:p>
       <w:r>
-        <w:t>Create a Linux VM or LXC in Proxmox, install Docker, configure a non-root SSH deployment user and firewall, and use the SSH Docker host URL. Do not expose port 2375.</w:t>
+        <w:t>The implemented persistent environment runs Docker in a Proxmox VM/LXC and exposes the dashboard at the verified endpoint below. Terraform supports management over SSH; plain Docker TCP port 2375 must remain disabled.</w:t>
       </w:r>
+    </w:p>
+    <w:p>
+      <w:r>
+        <w:t xml:space="preserve">Verified live dashboard: </w:t>
+      </w:r>
+      <w:hyperlink r:id="rId15">
+        <w:r>
+          <w:rPr>
+            <w:color w:val="0563C1"/>
+            <w:u w:val="single"/>
+          </w:rPr>
+          <w:t>http://51.158.200.169:8050</w:t>
+        </w:r>
+      </w:hyperlink>
+      <w:r>
+        <w:t xml:space="preserve"> | API: </w:t>
+      </w:r>
+      <w:hyperlink r:id="rId16">
+        <w:r>
+          <w:rPr>
+            <w:color w:val="0563C1"/>
+            <w:u w:val="single"/>
+          </w:rPr>
+          <w:t>http://51.158.200.169:8000</w:t>
+        </w:r>
+      </w:hyperlink>
     </w:p>
     <w:p>
       <w:pPr>
@@ -7517,7 +7543,7 @@
                 <w:rFonts w:ascii="Calibri" w:hAnsi="Calibri"/>
                 <w:sz w:val="18"/>
               </w:rPr>
-              <w:t>Rotate previously exposed credentials and decide on coordinated history cleanup.</w:t>
+              <w:t>Replace demo credentials with unique protected production values.</w:t>
             </w:r>
           </w:p>
         </w:tc>
@@ -7665,7 +7691,7 @@
                 <w:rFonts w:ascii="Calibri" w:hAnsi="Calibri"/>
                 <w:sz w:val="18"/>
               </w:rPr>
-              <w:t>Add persistent dev and approved production deployment targets.</w:t>
+              <w:t>Harden the Proxmox demo and define an approved production release target.</w:t>
             </w:r>
           </w:p>
         </w:tc>
@@ -8008,12 +8034,12 @@
     </w:p>
     <w:p>
       <w:r>
-        <w:t>The project demonstrates the complete shape of a modern DataOps delivery system and has a working CI validation pipeline. Step 5 is implemented and verified. Docker, tests, and Kubernetes validation are substantial. Terraform now supports a secure local or Proxmox-over-SSH target, monitoring provisioning is corrected, and security/backup checks are automated. A persistent environment and production controls remain.</w:t>
+        <w:t>The project demonstrates a modern DataOps delivery system with verified CI validation and a persistent Proxmox-hosted demonstration. Step 5 is implemented: tests, Terraform validation, GHCR, Trivy, Kind deployment, and smoke tests pass. Kind proves Kubernetes deployability; Proxmox keeps the dashboard and API continuously reachable.</w:t>
       </w:r>
     </w:p>
     <w:p>
       <w:r>
-        <w:t>The immediate external actions are credential rotation, confirmation that the former Docker endpoint is disabled, and selection of a persistent target. Proxmox is appropriate when an existing secured host is available; Proxmox plus k3s is the stronger persistent Kubernetes option.</w:t>
+        <w:t>The remaining production actions are unique protected credentials, HTTPS, firewall review, approved release controls, monitoring alerts, and a restore exercise. The current Proxmox Docker deployment is persistent but does not replace the Kubernetes validation required by Step 4.</w:t>
       </w:r>
     </w:p>
     <w:p>

</xml_diff>

<commit_message>
docs: finalize report and deployment guidance
</commit_message>
<xml_diff>
--- a/DST_Airlines_Documentation.docx
+++ b/DST_Airlines_Documentation.docx
@@ -199,67 +199,13 @@
               <w:spacing w:after="0"/>
               <w:ind w:left="0"/>
             </w:pPr>
-            <w:hyperlink w:anchor="requirements_assessment" w:history="1">
-              <w:r>
-                <w:rPr>
-                  <w:color w:val="1D4ED8"/>
-                  <w:u w:val="single"/>
-                </w:rPr>
-                <w:t>2. Requirements assessment</w:t>
-              </w:r>
-            </w:hyperlink>
-          </w:p>
-        </w:tc>
-        <w:tc>
-          <w:tcPr>
-            <w:tcW w:type="dxa" w:w="864"/>
-            <w:tcMar>
-              <w:top w:w="45" w:type="dxa"/>
-              <w:start w:w="40" w:type="dxa"/>
-              <w:bottom w:w="45" w:type="dxa"/>
-              <w:end w:w="40" w:type="dxa"/>
-            </w:tcMar>
-            <w:vAlign w:val="center"/>
-          </w:tcPr>
-          <w:p>
-            <w:pPr>
-              <w:spacing w:after="0"/>
-              <w:jc w:val="right"/>
-            </w:pPr>
-            <w:r>
-              <w:rPr>
-                <w:color w:val="475569"/>
-                <w:sz w:val="20"/>
-              </w:rPr>
-              <w:t>3</w:t>
-            </w:r>
-          </w:p>
-        </w:tc>
-      </w:tr>
-      <w:tr>
-        <w:tc>
-          <w:tcPr>
-            <w:tcW w:type="dxa" w:w="8496"/>
-            <w:tcMar>
-              <w:top w:w="45" w:type="dxa"/>
-              <w:start w:w="40" w:type="dxa"/>
-              <w:bottom w:w="45" w:type="dxa"/>
-              <w:end w:w="40" w:type="dxa"/>
-            </w:tcMar>
-            <w:vAlign w:val="center"/>
-          </w:tcPr>
-          <w:p>
-            <w:pPr>
-              <w:spacing w:after="0"/>
-              <w:ind w:left="0"/>
-            </w:pPr>
             <w:hyperlink w:anchor="application_architecture" w:history="1">
               <w:r>
                 <w:rPr>
                   <w:color w:val="1D4ED8"/>
                   <w:u w:val="single"/>
                 </w:rPr>
-                <w:t>3. Application architecture</w:t>
+                <w:t>2. Application architecture</w:t>
               </w:r>
             </w:hyperlink>
           </w:p>
@@ -313,7 +259,7 @@
                   <w:color w:val="1D4ED8"/>
                   <w:u w:val="single"/>
                 </w:rPr>
-                <w:t>4. Docker and environments</w:t>
+                <w:t>3. Docker and environments</w:t>
               </w:r>
             </w:hyperlink>
           </w:p>
@@ -367,7 +313,7 @@
                   <w:color w:val="1D4ED8"/>
                   <w:u w:val="single"/>
                 </w:rPr>
-                <w:t>5. Testing</w:t>
+                <w:t>4. Testing</w:t>
               </w:r>
             </w:hyperlink>
           </w:p>
@@ -393,7 +339,7 @@
                 <w:color w:val="475569"/>
                 <w:sz w:val="20"/>
               </w:rPr>
-              <w:t>6</w:t>
+              <w:t>5</w:t>
             </w:r>
           </w:p>
         </w:tc>
@@ -421,7 +367,7 @@
                   <w:color w:val="1D4ED8"/>
                   <w:u w:val="single"/>
                 </w:rPr>
-                <w:t>6. CI/CD pipeline - Step 5</w:t>
+                <w:t>5. CI/CD pipeline - Step 5</w:t>
               </w:r>
             </w:hyperlink>
           </w:p>
@@ -475,7 +421,61 @@
                   <w:color w:val="1D4ED8"/>
                   <w:u w:val="single"/>
                 </w:rPr>
-                <w:t>7. Kubernetes - Step 4</w:t>
+                <w:t>6. Kubernetes - Step 4</w:t>
+              </w:r>
+            </w:hyperlink>
+          </w:p>
+        </w:tc>
+        <w:tc>
+          <w:tcPr>
+            <w:tcW w:type="dxa" w:w="864"/>
+            <w:tcMar>
+              <w:top w:w="45" w:type="dxa"/>
+              <w:start w:w="40" w:type="dxa"/>
+              <w:bottom w:w="45" w:type="dxa"/>
+              <w:end w:w="40" w:type="dxa"/>
+            </w:tcMar>
+            <w:vAlign w:val="center"/>
+          </w:tcPr>
+          <w:p>
+            <w:pPr>
+              <w:spacing w:after="0"/>
+              <w:jc w:val="right"/>
+            </w:pPr>
+            <w:r>
+              <w:rPr>
+                <w:color w:val="475569"/>
+                <w:sz w:val="20"/>
+              </w:rPr>
+              <w:t>7</w:t>
+            </w:r>
+          </w:p>
+        </w:tc>
+      </w:tr>
+      <w:tr>
+        <w:tc>
+          <w:tcPr>
+            <w:tcW w:type="dxa" w:w="8496"/>
+            <w:tcMar>
+              <w:top w:w="45" w:type="dxa"/>
+              <w:start w:w="40" w:type="dxa"/>
+              <w:bottom w:w="45" w:type="dxa"/>
+              <w:end w:w="40" w:type="dxa"/>
+            </w:tcMar>
+            <w:vAlign w:val="center"/>
+          </w:tcPr>
+          <w:p>
+            <w:pPr>
+              <w:spacing w:after="0"/>
+              <w:ind w:left="0"/>
+            </w:pPr>
+            <w:hyperlink w:anchor="terraform_proxmox" w:history="1">
+              <w:r>
+                <w:rPr>
+                  <w:color w:val="1D4ED8"/>
+                  <w:u w:val="single"/>
+                </w:rPr>
+                <w:t>7. Terraform and Proxmox - Step 6</w:t>
               </w:r>
             </w:hyperlink>
           </w:p>
@@ -523,67 +523,13 @@
               <w:spacing w:after="0"/>
               <w:ind w:left="0"/>
             </w:pPr>
-            <w:hyperlink w:anchor="terraform_proxmox" w:history="1">
-              <w:r>
-                <w:rPr>
-                  <w:color w:val="1D4ED8"/>
-                  <w:u w:val="single"/>
-                </w:rPr>
-                <w:t>8. Terraform and Proxmox - Step 6</w:t>
-              </w:r>
-            </w:hyperlink>
-          </w:p>
-        </w:tc>
-        <w:tc>
-          <w:tcPr>
-            <w:tcW w:type="dxa" w:w="864"/>
-            <w:tcMar>
-              <w:top w:w="45" w:type="dxa"/>
-              <w:start w:w="40" w:type="dxa"/>
-              <w:bottom w:w="45" w:type="dxa"/>
-              <w:end w:w="40" w:type="dxa"/>
-            </w:tcMar>
-            <w:vAlign w:val="center"/>
-          </w:tcPr>
-          <w:p>
-            <w:pPr>
-              <w:spacing w:after="0"/>
-              <w:jc w:val="right"/>
-            </w:pPr>
-            <w:r>
-              <w:rPr>
-                <w:color w:val="475569"/>
-                <w:sz w:val="20"/>
-              </w:rPr>
-              <w:t>9</w:t>
-            </w:r>
-          </w:p>
-        </w:tc>
-      </w:tr>
-      <w:tr>
-        <w:tc>
-          <w:tcPr>
-            <w:tcW w:type="dxa" w:w="8496"/>
-            <w:tcMar>
-              <w:top w:w="45" w:type="dxa"/>
-              <w:start w:w="40" w:type="dxa"/>
-              <w:bottom w:w="45" w:type="dxa"/>
-              <w:end w:w="40" w:type="dxa"/>
-            </w:tcMar>
-            <w:vAlign w:val="center"/>
-          </w:tcPr>
-          <w:p>
-            <w:pPr>
-              <w:spacing w:after="0"/>
-              <w:ind w:left="0"/>
-            </w:pPr>
             <w:hyperlink w:anchor="monitoring" w:history="1">
               <w:r>
                 <w:rPr>
                   <w:color w:val="1D4ED8"/>
                   <w:u w:val="single"/>
                 </w:rPr>
-                <w:t>9. Monitoring - Step 7</w:t>
+                <w:t>8. Monitoring - Step 7</w:t>
               </w:r>
             </w:hyperlink>
           </w:p>
@@ -637,7 +583,61 @@
                   <w:color w:val="1D4ED8"/>
                   <w:u w:val="single"/>
                 </w:rPr>
-                <w:t>10. Security and DevSecOps - Step 8</w:t>
+                <w:t>9. Security and DevSecOps - Step 8</w:t>
+              </w:r>
+            </w:hyperlink>
+          </w:p>
+        </w:tc>
+        <w:tc>
+          <w:tcPr>
+            <w:tcW w:type="dxa" w:w="864"/>
+            <w:tcMar>
+              <w:top w:w="45" w:type="dxa"/>
+              <w:start w:w="40" w:type="dxa"/>
+              <w:bottom w:w="45" w:type="dxa"/>
+              <w:end w:w="40" w:type="dxa"/>
+            </w:tcMar>
+            <w:vAlign w:val="center"/>
+          </w:tcPr>
+          <w:p>
+            <w:pPr>
+              <w:spacing w:after="0"/>
+              <w:jc w:val="right"/>
+            </w:pPr>
+            <w:r>
+              <w:rPr>
+                <w:color w:val="475569"/>
+                <w:sz w:val="20"/>
+              </w:rPr>
+              <w:t>9</w:t>
+            </w:r>
+          </w:p>
+        </w:tc>
+      </w:tr>
+      <w:tr>
+        <w:tc>
+          <w:tcPr>
+            <w:tcW w:type="dxa" w:w="8496"/>
+            <w:tcMar>
+              <w:top w:w="45" w:type="dxa"/>
+              <w:start w:w="40" w:type="dxa"/>
+              <w:bottom w:w="45" w:type="dxa"/>
+              <w:end w:w="40" w:type="dxa"/>
+            </w:tcMar>
+            <w:vAlign w:val="center"/>
+          </w:tcPr>
+          <w:p>
+            <w:pPr>
+              <w:spacing w:after="0"/>
+              <w:ind w:left="0"/>
+            </w:pPr>
+            <w:hyperlink w:anchor="disaster_recovery" w:history="1">
+              <w:r>
+                <w:rPr>
+                  <w:color w:val="1D4ED8"/>
+                  <w:u w:val="single"/>
+                </w:rPr>
+                <w:t>10. Disaster recovery - Step 9</w:t>
               </w:r>
             </w:hyperlink>
           </w:p>
@@ -685,67 +685,13 @@
               <w:spacing w:after="0"/>
               <w:ind w:left="0"/>
             </w:pPr>
-            <w:hyperlink w:anchor="disaster_recovery" w:history="1">
-              <w:r>
-                <w:rPr>
-                  <w:color w:val="1D4ED8"/>
-                  <w:u w:val="single"/>
-                </w:rPr>
-                <w:t>11. Disaster recovery - Step 9</w:t>
-              </w:r>
-            </w:hyperlink>
-          </w:p>
-        </w:tc>
-        <w:tc>
-          <w:tcPr>
-            <w:tcW w:type="dxa" w:w="864"/>
-            <w:tcMar>
-              <w:top w:w="45" w:type="dxa"/>
-              <w:start w:w="40" w:type="dxa"/>
-              <w:bottom w:w="45" w:type="dxa"/>
-              <w:end w:w="40" w:type="dxa"/>
-            </w:tcMar>
-            <w:vAlign w:val="center"/>
-          </w:tcPr>
-          <w:p>
-            <w:pPr>
-              <w:spacing w:after="0"/>
-              <w:jc w:val="right"/>
-            </w:pPr>
-            <w:r>
-              <w:rPr>
-                <w:color w:val="475569"/>
-                <w:sz w:val="20"/>
-              </w:rPr>
-              <w:t>11</w:t>
-            </w:r>
-          </w:p>
-        </w:tc>
-      </w:tr>
-      <w:tr>
-        <w:tc>
-          <w:tcPr>
-            <w:tcW w:type="dxa" w:w="8496"/>
-            <w:tcMar>
-              <w:top w:w="45" w:type="dxa"/>
-              <w:start w:w="40" w:type="dxa"/>
-              <w:bottom w:w="45" w:type="dxa"/>
-              <w:end w:w="40" w:type="dxa"/>
-            </w:tcMar>
-            <w:vAlign w:val="center"/>
-          </w:tcPr>
-          <w:p>
-            <w:pPr>
-              <w:spacing w:after="0"/>
-              <w:ind w:left="0"/>
-            </w:pPr>
             <w:hyperlink w:anchor="setup_operations" w:history="1">
               <w:r>
                 <w:rPr>
                   <w:color w:val="1D4ED8"/>
                   <w:u w:val="single"/>
                 </w:rPr>
-                <w:t>12. Setup and operations</w:t>
+                <w:t>11. Setup and operations</w:t>
               </w:r>
             </w:hyperlink>
           </w:p>
@@ -799,7 +745,7 @@
                   <w:color w:val="1D4ED8"/>
                   <w:u w:val="single"/>
                 </w:rPr>
-                <w:t>12.1 Docker development</w:t>
+                <w:t>11.1 Docker development</w:t>
               </w:r>
             </w:hyperlink>
           </w:p>
@@ -853,7 +799,7 @@
                   <w:color w:val="1D4ED8"/>
                   <w:u w:val="single"/>
                 </w:rPr>
-                <w:t>12.2 Kubernetes</w:t>
+                <w:t>11.2 Kubernetes</w:t>
               </w:r>
             </w:hyperlink>
           </w:p>
@@ -907,7 +853,7 @@
                   <w:color w:val="1D4ED8"/>
                   <w:u w:val="single"/>
                 </w:rPr>
-                <w:t>12.3 Terraform on Proxmox</w:t>
+                <w:t>11.3 Terraform on Proxmox</w:t>
               </w:r>
             </w:hyperlink>
           </w:p>
@@ -933,7 +879,7 @@
                 <w:color w:val="475569"/>
                 <w:sz w:val="20"/>
               </w:rPr>
-              <w:t>12</w:t>
+              <w:t>11</w:t>
             </w:r>
           </w:p>
         </w:tc>
@@ -961,7 +907,7 @@
                   <w:color w:val="1D4ED8"/>
                   <w:u w:val="single"/>
                 </w:rPr>
-                <w:t>13. Remaining actions</w:t>
+                <w:t>12. Next steps</w:t>
               </w:r>
             </w:hyperlink>
           </w:p>
@@ -1015,7 +961,7 @@
                   <w:color w:val="1D4ED8"/>
                   <w:u w:val="single"/>
                 </w:rPr>
-                <w:t>14. Conclusion</w:t>
+                <w:t>13. Conclusion</w:t>
               </w:r>
             </w:hyperlink>
           </w:p>
@@ -1187,1125 +1133,6 @@
       </w:r>
     </w:p>
     <w:p>
-      <w:bookmarkStart w:id="2" w:name="requirements_assessment"/>
-      <w:pPr>
-        <w:pStyle w:val="Heading1"/>
-      </w:pPr>
-      <w:r>
-        <w:t>2. Requirements assessment</w:t>
-      </w:r>
-      <w:bookmarkEnd w:id="2"/>
-    </w:p>
-    <w:tbl>
-      <w:tblPr>
-        <w:tblStyle w:val="TableGrid"/>
-        <w:tblW w:type="dxa" w:w="9360"/>
-        <w:jc w:val="center"/>
-        <w:tblLayout w:type="fixed"/>
-        <w:tblLook w:firstColumn="1" w:firstRow="1" w:lastColumn="0" w:lastRow="0" w:noHBand="0" w:noVBand="1" w:val="04A0"/>
-        <w:tblInd w:w="120" w:type="dxa"/>
-      </w:tblPr>
-      <w:tblGrid>
-        <w:gridCol w:w="2340"/>
-        <w:gridCol w:w="2340"/>
-        <w:gridCol w:w="2340"/>
-        <w:gridCol w:w="2340"/>
-      </w:tblGrid>
-      <w:tr>
-        <w:trPr>
-          <w:tblHeader w:val="true"/>
-        </w:trPr>
-        <w:tc>
-          <w:tcPr>
-            <w:tcW w:type="dxa" w:w="648"/>
-            <w:vAlign w:val="center"/>
-            <w:tcMar>
-              <w:top w:w="80" w:type="dxa"/>
-              <w:start w:w="120" w:type="dxa"/>
-              <w:bottom w:w="80" w:type="dxa"/>
-              <w:end w:w="120" w:type="dxa"/>
-            </w:tcMar>
-            <w:shd w:fill="DBEAFE"/>
-          </w:tcPr>
-          <w:p>
-            <w:pPr>
-              <w:spacing w:after="0" w:line="252" w:lineRule="auto"/>
-            </w:pPr>
-            <w:r>
-              <w:rPr>
-                <w:rFonts w:ascii="Calibri" w:hAnsi="Calibri"/>
-                <w:b/>
-                <w:color w:val="0F172A"/>
-                <w:sz w:val="18"/>
-              </w:rPr>
-              <w:t>Step</w:t>
-            </w:r>
-          </w:p>
-        </w:tc>
-        <w:tc>
-          <w:tcPr>
-            <w:tcW w:type="dxa" w:w="1800"/>
-            <w:vAlign w:val="center"/>
-            <w:tcMar>
-              <w:top w:w="80" w:type="dxa"/>
-              <w:start w:w="120" w:type="dxa"/>
-              <w:bottom w:w="80" w:type="dxa"/>
-              <w:end w:w="120" w:type="dxa"/>
-            </w:tcMar>
-            <w:shd w:fill="DBEAFE"/>
-          </w:tcPr>
-          <w:p>
-            <w:pPr>
-              <w:spacing w:after="0" w:line="252" w:lineRule="auto"/>
-            </w:pPr>
-            <w:r>
-              <w:rPr>
-                <w:rFonts w:ascii="Calibri" w:hAnsi="Calibri"/>
-                <w:b/>
-                <w:color w:val="0F172A"/>
-                <w:sz w:val="18"/>
-              </w:rPr>
-              <w:t>Requirement</w:t>
-            </w:r>
-          </w:p>
-        </w:tc>
-        <w:tc>
-          <w:tcPr>
-            <w:tcW w:type="dxa" w:w="1584"/>
-            <w:vAlign w:val="center"/>
-            <w:tcMar>
-              <w:top w:w="80" w:type="dxa"/>
-              <w:start w:w="120" w:type="dxa"/>
-              <w:bottom w:w="80" w:type="dxa"/>
-              <w:end w:w="120" w:type="dxa"/>
-            </w:tcMar>
-            <w:shd w:fill="DBEAFE"/>
-          </w:tcPr>
-          <w:p>
-            <w:pPr>
-              <w:spacing w:after="0" w:line="252" w:lineRule="auto"/>
-            </w:pPr>
-            <w:r>
-              <w:rPr>
-                <w:rFonts w:ascii="Calibri" w:hAnsi="Calibri"/>
-                <w:b/>
-                <w:color w:val="0F172A"/>
-                <w:sz w:val="18"/>
-              </w:rPr>
-              <w:t>Owner</w:t>
-            </w:r>
-          </w:p>
-        </w:tc>
-        <w:tc>
-          <w:tcPr>
-            <w:tcW w:type="dxa" w:w="5328"/>
-            <w:vAlign w:val="center"/>
-            <w:tcMar>
-              <w:top w:w="80" w:type="dxa"/>
-              <w:start w:w="120" w:type="dxa"/>
-              <w:bottom w:w="80" w:type="dxa"/>
-              <w:end w:w="120" w:type="dxa"/>
-            </w:tcMar>
-            <w:shd w:fill="DBEAFE"/>
-          </w:tcPr>
-          <w:p>
-            <w:pPr>
-              <w:spacing w:after="0" w:line="252" w:lineRule="auto"/>
-            </w:pPr>
-            <w:r>
-              <w:rPr>
-                <w:rFonts w:ascii="Calibri" w:hAnsi="Calibri"/>
-                <w:b/>
-                <w:color w:val="0F172A"/>
-                <w:sz w:val="18"/>
-              </w:rPr>
-              <w:t>Status and evidence</w:t>
-            </w:r>
-          </w:p>
-        </w:tc>
-      </w:tr>
-      <w:tr>
-        <w:tc>
-          <w:tcPr>
-            <w:tcW w:type="dxa" w:w="648"/>
-            <w:vAlign w:val="center"/>
-            <w:tcMar>
-              <w:top w:w="80" w:type="dxa"/>
-              <w:start w:w="120" w:type="dxa"/>
-              <w:bottom w:w="80" w:type="dxa"/>
-              <w:end w:w="120" w:type="dxa"/>
-            </w:tcMar>
-          </w:tcPr>
-          <w:p>
-            <w:pPr>
-              <w:spacing w:after="0" w:line="252" w:lineRule="auto"/>
-            </w:pPr>
-            <w:r>
-              <w:rPr>
-                <w:rFonts w:ascii="Calibri" w:hAnsi="Calibri"/>
-                <w:sz w:val="18"/>
-              </w:rPr>
-              <w:t>1</w:t>
-            </w:r>
-          </w:p>
-        </w:tc>
-        <w:tc>
-          <w:tcPr>
-            <w:tcW w:type="dxa" w:w="1800"/>
-            <w:vAlign w:val="center"/>
-            <w:tcMar>
-              <w:top w:w="80" w:type="dxa"/>
-              <w:start w:w="120" w:type="dxa"/>
-              <w:bottom w:w="80" w:type="dxa"/>
-              <w:end w:w="120" w:type="dxa"/>
-            </w:tcMar>
-          </w:tcPr>
-          <w:p>
-            <w:pPr>
-              <w:spacing w:after="0" w:line="252" w:lineRule="auto"/>
-            </w:pPr>
-            <w:r>
-              <w:rPr>
-                <w:rFonts w:ascii="Calibri" w:hAnsi="Calibri"/>
-                <w:sz w:val="18"/>
-              </w:rPr>
-              <w:t>Docker</w:t>
-            </w:r>
-          </w:p>
-        </w:tc>
-        <w:tc>
-          <w:tcPr>
-            <w:tcW w:type="dxa" w:w="1584"/>
-            <w:vAlign w:val="center"/>
-            <w:tcMar>
-              <w:top w:w="80" w:type="dxa"/>
-              <w:start w:w="120" w:type="dxa"/>
-              <w:bottom w:w="80" w:type="dxa"/>
-              <w:end w:w="120" w:type="dxa"/>
-            </w:tcMar>
-          </w:tcPr>
-          <w:p>
-            <w:pPr>
-              <w:spacing w:after="0" w:line="252" w:lineRule="auto"/>
-            </w:pPr>
-            <w:r>
-              <w:rPr>
-                <w:rFonts w:ascii="Calibri" w:hAnsi="Calibri"/>
-                <w:sz w:val="18"/>
-              </w:rPr>
-              <w:t>Ali + Hassan</w:t>
-            </w:r>
-          </w:p>
-        </w:tc>
-        <w:tc>
-          <w:tcPr>
-            <w:tcW w:type="dxa" w:w="5328"/>
-            <w:vAlign w:val="center"/>
-            <w:tcMar>
-              <w:top w:w="80" w:type="dxa"/>
-              <w:start w:w="120" w:type="dxa"/>
-              <w:bottom w:w="80" w:type="dxa"/>
-              <w:end w:w="120" w:type="dxa"/>
-            </w:tcMar>
-          </w:tcPr>
-          <w:p>
-            <w:pPr>
-              <w:spacing w:after="0" w:line="252" w:lineRule="auto"/>
-            </w:pPr>
-            <w:r>
-              <w:rPr>
-                <w:rFonts w:ascii="Calibri" w:hAnsi="Calibri"/>
-                <w:sz w:val="18"/>
-              </w:rPr>
-              <w:t>Implemented: API/dashboard images and Compose stacks.</w:t>
-            </w:r>
-          </w:p>
-        </w:tc>
-      </w:tr>
-      <w:tr>
-        <w:tc>
-          <w:tcPr>
-            <w:tcW w:type="dxa" w:w="648"/>
-            <w:vAlign w:val="center"/>
-            <w:tcMar>
-              <w:top w:w="80" w:type="dxa"/>
-              <w:start w:w="120" w:type="dxa"/>
-              <w:bottom w:w="80" w:type="dxa"/>
-              <w:end w:w="120" w:type="dxa"/>
-            </w:tcMar>
-          </w:tcPr>
-          <w:p>
-            <w:pPr>
-              <w:spacing w:after="0" w:line="252" w:lineRule="auto"/>
-            </w:pPr>
-            <w:r>
-              <w:rPr>
-                <w:rFonts w:ascii="Calibri" w:hAnsi="Calibri"/>
-                <w:sz w:val="18"/>
-              </w:rPr>
-              <w:t>2</w:t>
-            </w:r>
-          </w:p>
-        </w:tc>
-        <w:tc>
-          <w:tcPr>
-            <w:tcW w:type="dxa" w:w="1800"/>
-            <w:vAlign w:val="center"/>
-            <w:tcMar>
-              <w:top w:w="80" w:type="dxa"/>
-              <w:start w:w="120" w:type="dxa"/>
-              <w:bottom w:w="80" w:type="dxa"/>
-              <w:end w:w="120" w:type="dxa"/>
-            </w:tcMar>
-          </w:tcPr>
-          <w:p>
-            <w:pPr>
-              <w:spacing w:after="0" w:line="252" w:lineRule="auto"/>
-            </w:pPr>
-            <w:r>
-              <w:rPr>
-                <w:rFonts w:ascii="Calibri" w:hAnsi="Calibri"/>
-                <w:sz w:val="18"/>
-              </w:rPr>
-              <w:t>Dev and prod</w:t>
-            </w:r>
-          </w:p>
-        </w:tc>
-        <w:tc>
-          <w:tcPr>
-            <w:tcW w:type="dxa" w:w="1584"/>
-            <w:vAlign w:val="center"/>
-            <w:tcMar>
-              <w:top w:w="80" w:type="dxa"/>
-              <w:start w:w="120" w:type="dxa"/>
-              <w:bottom w:w="80" w:type="dxa"/>
-              <w:end w:w="120" w:type="dxa"/>
-            </w:tcMar>
-          </w:tcPr>
-          <w:p>
-            <w:pPr>
-              <w:spacing w:after="0" w:line="252" w:lineRule="auto"/>
-            </w:pPr>
-            <w:r>
-              <w:rPr>
-                <w:rFonts w:ascii="Calibri" w:hAnsi="Calibri"/>
-                <w:sz w:val="18"/>
-              </w:rPr>
-              <w:t>Ali + Hassan</w:t>
-            </w:r>
-          </w:p>
-        </w:tc>
-        <w:tc>
-          <w:tcPr>
-            <w:tcW w:type="dxa" w:w="5328"/>
-            <w:vAlign w:val="center"/>
-            <w:tcMar>
-              <w:top w:w="80" w:type="dxa"/>
-              <w:start w:w="120" w:type="dxa"/>
-              <w:bottom w:w="80" w:type="dxa"/>
-              <w:end w:w="120" w:type="dxa"/>
-            </w:tcMar>
-          </w:tcPr>
-          <w:p>
-            <w:pPr>
-              <w:spacing w:after="0" w:line="252" w:lineRule="auto"/>
-            </w:pPr>
-            <w:r>
-              <w:rPr>
-                <w:rFonts w:ascii="Calibri" w:hAnsi="Calibri"/>
-                <w:sz w:val="18"/>
-              </w:rPr>
-              <w:t>Configured; persistent Proxmox demonstration verified live.</w:t>
-            </w:r>
-          </w:p>
-        </w:tc>
-      </w:tr>
-      <w:tr>
-        <w:tc>
-          <w:tcPr>
-            <w:tcW w:type="dxa" w:w="648"/>
-            <w:vAlign w:val="center"/>
-            <w:tcMar>
-              <w:top w:w="80" w:type="dxa"/>
-              <w:start w:w="120" w:type="dxa"/>
-              <w:bottom w:w="80" w:type="dxa"/>
-              <w:end w:w="120" w:type="dxa"/>
-            </w:tcMar>
-          </w:tcPr>
-          <w:p>
-            <w:pPr>
-              <w:spacing w:after="0" w:line="252" w:lineRule="auto"/>
-            </w:pPr>
-            <w:r>
-              <w:rPr>
-                <w:rFonts w:ascii="Calibri" w:hAnsi="Calibri"/>
-                <w:sz w:val="18"/>
-              </w:rPr>
-              <w:t>3</w:t>
-            </w:r>
-          </w:p>
-        </w:tc>
-        <w:tc>
-          <w:tcPr>
-            <w:tcW w:type="dxa" w:w="1800"/>
-            <w:vAlign w:val="center"/>
-            <w:tcMar>
-              <w:top w:w="80" w:type="dxa"/>
-              <w:start w:w="120" w:type="dxa"/>
-              <w:bottom w:w="80" w:type="dxa"/>
-              <w:end w:w="120" w:type="dxa"/>
-            </w:tcMar>
-          </w:tcPr>
-          <w:p>
-            <w:pPr>
-              <w:spacing w:after="0" w:line="252" w:lineRule="auto"/>
-            </w:pPr>
-            <w:r>
-              <w:rPr>
-                <w:rFonts w:ascii="Calibri" w:hAnsi="Calibri"/>
-                <w:sz w:val="18"/>
-              </w:rPr>
-              <w:t>Testing</w:t>
-            </w:r>
-          </w:p>
-        </w:tc>
-        <w:tc>
-          <w:tcPr>
-            <w:tcW w:type="dxa" w:w="1584"/>
-            <w:vAlign w:val="center"/>
-            <w:tcMar>
-              <w:top w:w="80" w:type="dxa"/>
-              <w:start w:w="120" w:type="dxa"/>
-              <w:bottom w:w="80" w:type="dxa"/>
-              <w:end w:w="120" w:type="dxa"/>
-            </w:tcMar>
-          </w:tcPr>
-          <w:p>
-            <w:pPr>
-              <w:spacing w:after="0" w:line="252" w:lineRule="auto"/>
-            </w:pPr>
-            <w:r>
-              <w:rPr>
-                <w:rFonts w:ascii="Calibri" w:hAnsi="Calibri"/>
-                <w:sz w:val="18"/>
-              </w:rPr>
-              <w:t>Hassan</w:t>
-            </w:r>
-          </w:p>
-        </w:tc>
-        <w:tc>
-          <w:tcPr>
-            <w:tcW w:type="dxa" w:w="5328"/>
-            <w:vAlign w:val="center"/>
-            <w:tcMar>
-              <w:top w:w="80" w:type="dxa"/>
-              <w:start w:w="120" w:type="dxa"/>
-              <w:bottom w:w="80" w:type="dxa"/>
-              <w:end w:w="120" w:type="dxa"/>
-            </w:tcMar>
-          </w:tcPr>
-          <w:p>
-            <w:pPr>
-              <w:spacing w:after="0" w:line="252" w:lineRule="auto"/>
-            </w:pPr>
-            <w:r>
-              <w:rPr>
-                <w:rFonts w:ascii="Calibri" w:hAnsi="Calibri"/>
-                <w:sz w:val="18"/>
-              </w:rPr>
-              <w:t>47 API + 34 dashboard tests; latest main test job passed.</w:t>
-            </w:r>
-          </w:p>
-        </w:tc>
-      </w:tr>
-      <w:tr>
-        <w:tc>
-          <w:tcPr>
-            <w:tcW w:type="dxa" w:w="648"/>
-            <w:vAlign w:val="center"/>
-            <w:tcMar>
-              <w:top w:w="80" w:type="dxa"/>
-              <w:start w:w="120" w:type="dxa"/>
-              <w:bottom w:w="80" w:type="dxa"/>
-              <w:end w:w="120" w:type="dxa"/>
-            </w:tcMar>
-          </w:tcPr>
-          <w:p>
-            <w:pPr>
-              <w:spacing w:after="0" w:line="252" w:lineRule="auto"/>
-            </w:pPr>
-            <w:r>
-              <w:rPr>
-                <w:rFonts w:ascii="Calibri" w:hAnsi="Calibri"/>
-                <w:sz w:val="18"/>
-              </w:rPr>
-              <w:t>4</w:t>
-            </w:r>
-          </w:p>
-        </w:tc>
-        <w:tc>
-          <w:tcPr>
-            <w:tcW w:type="dxa" w:w="1800"/>
-            <w:vAlign w:val="center"/>
-            <w:tcMar>
-              <w:top w:w="80" w:type="dxa"/>
-              <w:start w:w="120" w:type="dxa"/>
-              <w:bottom w:w="80" w:type="dxa"/>
-              <w:end w:w="120" w:type="dxa"/>
-            </w:tcMar>
-          </w:tcPr>
-          <w:p>
-            <w:pPr>
-              <w:spacing w:after="0" w:line="252" w:lineRule="auto"/>
-            </w:pPr>
-            <w:r>
-              <w:rPr>
-                <w:rFonts w:ascii="Calibri" w:hAnsi="Calibri"/>
-                <w:sz w:val="18"/>
-              </w:rPr>
-              <w:t>Kubernetes</w:t>
-            </w:r>
-          </w:p>
-        </w:tc>
-        <w:tc>
-          <w:tcPr>
-            <w:tcW w:type="dxa" w:w="1584"/>
-            <w:vAlign w:val="center"/>
-            <w:tcMar>
-              <w:top w:w="80" w:type="dxa"/>
-              <w:start w:w="120" w:type="dxa"/>
-              <w:bottom w:w="80" w:type="dxa"/>
-              <w:end w:w="120" w:type="dxa"/>
-            </w:tcMar>
-          </w:tcPr>
-          <w:p>
-            <w:pPr>
-              <w:spacing w:after="0" w:line="252" w:lineRule="auto"/>
-            </w:pPr>
-            <w:r>
-              <w:rPr>
-                <w:rFonts w:ascii="Calibri" w:hAnsi="Calibri"/>
-                <w:sz w:val="18"/>
-              </w:rPr>
-              <w:t>Ali</w:t>
-            </w:r>
-          </w:p>
-        </w:tc>
-        <w:tc>
-          <w:tcPr>
-            <w:tcW w:type="dxa" w:w="5328"/>
-            <w:vAlign w:val="center"/>
-            <w:tcMar>
-              <w:top w:w="80" w:type="dxa"/>
-              <w:start w:w="120" w:type="dxa"/>
-              <w:bottom w:w="80" w:type="dxa"/>
-              <w:end w:w="120" w:type="dxa"/>
-            </w:tcMar>
-          </w:tcPr>
-          <w:p>
-            <w:pPr>
-              <w:spacing w:after="0" w:line="252" w:lineRule="auto"/>
-            </w:pPr>
-            <w:r>
-              <w:rPr>
-                <w:rFonts w:ascii="Calibri" w:hAnsi="Calibri"/>
-                <w:sz w:val="18"/>
-              </w:rPr>
-              <w:t>Manifests and deployment script; temporary Kind validated.</w:t>
-            </w:r>
-          </w:p>
-        </w:tc>
-      </w:tr>
-      <w:tr>
-        <w:tc>
-          <w:tcPr>
-            <w:tcW w:type="dxa" w:w="648"/>
-            <w:vAlign w:val="center"/>
-            <w:tcMar>
-              <w:top w:w="80" w:type="dxa"/>
-              <w:start w:w="120" w:type="dxa"/>
-              <w:bottom w:w="80" w:type="dxa"/>
-              <w:end w:w="120" w:type="dxa"/>
-            </w:tcMar>
-          </w:tcPr>
-          <w:p>
-            <w:pPr>
-              <w:spacing w:after="0" w:line="252" w:lineRule="auto"/>
-            </w:pPr>
-            <w:r>
-              <w:rPr>
-                <w:rFonts w:ascii="Calibri" w:hAnsi="Calibri"/>
-                <w:sz w:val="18"/>
-              </w:rPr>
-              <w:t>5</w:t>
-            </w:r>
-          </w:p>
-        </w:tc>
-        <w:tc>
-          <w:tcPr>
-            <w:tcW w:type="dxa" w:w="1800"/>
-            <w:vAlign w:val="center"/>
-            <w:tcMar>
-              <w:top w:w="80" w:type="dxa"/>
-              <w:start w:w="120" w:type="dxa"/>
-              <w:bottom w:w="80" w:type="dxa"/>
-              <w:end w:w="120" w:type="dxa"/>
-            </w:tcMar>
-          </w:tcPr>
-          <w:p>
-            <w:pPr>
-              <w:spacing w:after="0" w:line="252" w:lineRule="auto"/>
-            </w:pPr>
-            <w:r>
-              <w:rPr>
-                <w:rFonts w:ascii="Calibri" w:hAnsi="Calibri"/>
-                <w:sz w:val="18"/>
-              </w:rPr>
-              <w:t>CI/CD</w:t>
-            </w:r>
-          </w:p>
-        </w:tc>
-        <w:tc>
-          <w:tcPr>
-            <w:tcW w:type="dxa" w:w="1584"/>
-            <w:vAlign w:val="center"/>
-            <w:tcMar>
-              <w:top w:w="80" w:type="dxa"/>
-              <w:start w:w="120" w:type="dxa"/>
-              <w:bottom w:w="80" w:type="dxa"/>
-              <w:end w:w="120" w:type="dxa"/>
-            </w:tcMar>
-          </w:tcPr>
-          <w:p>
-            <w:pPr>
-              <w:spacing w:after="0" w:line="252" w:lineRule="auto"/>
-            </w:pPr>
-            <w:r>
-              <w:rPr>
-                <w:rFonts w:ascii="Calibri" w:hAnsi="Calibri"/>
-                <w:sz w:val="18"/>
-              </w:rPr>
-              <w:t>Hassan</w:t>
-            </w:r>
-          </w:p>
-        </w:tc>
-        <w:tc>
-          <w:tcPr>
-            <w:tcW w:type="dxa" w:w="5328"/>
-            <w:vAlign w:val="center"/>
-            <w:tcMar>
-              <w:top w:w="80" w:type="dxa"/>
-              <w:start w:w="120" w:type="dxa"/>
-              <w:bottom w:w="80" w:type="dxa"/>
-              <w:end w:w="120" w:type="dxa"/>
-            </w:tcMar>
-          </w:tcPr>
-          <w:p>
-            <w:pPr>
-              <w:spacing w:after="0" w:line="252" w:lineRule="auto"/>
-            </w:pPr>
-            <w:r>
-              <w:rPr>
-                <w:rFonts w:ascii="Calibri" w:hAnsi="Calibri"/>
-                <w:sz w:val="18"/>
-              </w:rPr>
-              <w:t>Tests, Terraform, GHCR, Trivy, Kind, and smoke tests.</w:t>
-            </w:r>
-          </w:p>
-        </w:tc>
-      </w:tr>
-      <w:tr>
-        <w:tc>
-          <w:tcPr>
-            <w:tcW w:type="dxa" w:w="648"/>
-            <w:vAlign w:val="center"/>
-            <w:tcMar>
-              <w:top w:w="80" w:type="dxa"/>
-              <w:start w:w="120" w:type="dxa"/>
-              <w:bottom w:w="80" w:type="dxa"/>
-              <w:end w:w="120" w:type="dxa"/>
-            </w:tcMar>
-          </w:tcPr>
-          <w:p>
-            <w:pPr>
-              <w:spacing w:after="0" w:line="252" w:lineRule="auto"/>
-            </w:pPr>
-            <w:r>
-              <w:rPr>
-                <w:rFonts w:ascii="Calibri" w:hAnsi="Calibri"/>
-                <w:sz w:val="18"/>
-              </w:rPr>
-              <w:t>6</w:t>
-            </w:r>
-          </w:p>
-        </w:tc>
-        <w:tc>
-          <w:tcPr>
-            <w:tcW w:type="dxa" w:w="1800"/>
-            <w:vAlign w:val="center"/>
-            <w:tcMar>
-              <w:top w:w="80" w:type="dxa"/>
-              <w:start w:w="120" w:type="dxa"/>
-              <w:bottom w:w="80" w:type="dxa"/>
-              <w:end w:w="120" w:type="dxa"/>
-            </w:tcMar>
-          </w:tcPr>
-          <w:p>
-            <w:pPr>
-              <w:spacing w:after="0" w:line="252" w:lineRule="auto"/>
-            </w:pPr>
-            <w:r>
-              <w:rPr>
-                <w:rFonts w:ascii="Calibri" w:hAnsi="Calibri"/>
-                <w:sz w:val="18"/>
-              </w:rPr>
-              <w:t>Terraform IaC</w:t>
-            </w:r>
-          </w:p>
-        </w:tc>
-        <w:tc>
-          <w:tcPr>
-            <w:tcW w:type="dxa" w:w="1584"/>
-            <w:vAlign w:val="center"/>
-            <w:tcMar>
-              <w:top w:w="80" w:type="dxa"/>
-              <w:start w:w="120" w:type="dxa"/>
-              <w:bottom w:w="80" w:type="dxa"/>
-              <w:end w:w="120" w:type="dxa"/>
-            </w:tcMar>
-          </w:tcPr>
-          <w:p>
-            <w:pPr>
-              <w:spacing w:after="0" w:line="252" w:lineRule="auto"/>
-            </w:pPr>
-            <w:r>
-              <w:rPr>
-                <w:rFonts w:ascii="Calibri" w:hAnsi="Calibri"/>
-                <w:sz w:val="18"/>
-              </w:rPr>
-              <w:t>Ali</w:t>
-            </w:r>
-          </w:p>
-        </w:tc>
-        <w:tc>
-          <w:tcPr>
-            <w:tcW w:type="dxa" w:w="5328"/>
-            <w:vAlign w:val="center"/>
-            <w:tcMar>
-              <w:top w:w="80" w:type="dxa"/>
-              <w:start w:w="120" w:type="dxa"/>
-              <w:bottom w:w="80" w:type="dxa"/>
-              <w:end w:w="120" w:type="dxa"/>
-            </w:tcMar>
-          </w:tcPr>
-          <w:p>
-            <w:pPr>
-              <w:spacing w:after="0" w:line="252" w:lineRule="auto"/>
-            </w:pPr>
-            <w:r>
-              <w:rPr>
-                <w:rFonts w:ascii="Calibri" w:hAnsi="Calibri"/>
-                <w:sz w:val="18"/>
-              </w:rPr>
-              <w:t>Proxmox Docker guest is live; Terraform supports management over SSH.</w:t>
-            </w:r>
-          </w:p>
-        </w:tc>
-      </w:tr>
-      <w:tr>
-        <w:tc>
-          <w:tcPr>
-            <w:tcW w:type="dxa" w:w="648"/>
-            <w:vAlign w:val="center"/>
-            <w:tcMar>
-              <w:top w:w="80" w:type="dxa"/>
-              <w:start w:w="120" w:type="dxa"/>
-              <w:bottom w:w="80" w:type="dxa"/>
-              <w:end w:w="120" w:type="dxa"/>
-            </w:tcMar>
-          </w:tcPr>
-          <w:p>
-            <w:pPr>
-              <w:spacing w:after="0" w:line="252" w:lineRule="auto"/>
-            </w:pPr>
-            <w:r>
-              <w:rPr>
-                <w:rFonts w:ascii="Calibri" w:hAnsi="Calibri"/>
-                <w:sz w:val="18"/>
-              </w:rPr>
-              <w:t>7</w:t>
-            </w:r>
-          </w:p>
-        </w:tc>
-        <w:tc>
-          <w:tcPr>
-            <w:tcW w:type="dxa" w:w="1800"/>
-            <w:vAlign w:val="center"/>
-            <w:tcMar>
-              <w:top w:w="80" w:type="dxa"/>
-              <w:start w:w="120" w:type="dxa"/>
-              <w:bottom w:w="80" w:type="dxa"/>
-              <w:end w:w="120" w:type="dxa"/>
-            </w:tcMar>
-          </w:tcPr>
-          <w:p>
-            <w:pPr>
-              <w:spacing w:after="0" w:line="252" w:lineRule="auto"/>
-            </w:pPr>
-            <w:r>
-              <w:rPr>
-                <w:rFonts w:ascii="Calibri" w:hAnsi="Calibri"/>
-                <w:sz w:val="18"/>
-              </w:rPr>
-              <w:t>Monitoring</w:t>
-            </w:r>
-          </w:p>
-        </w:tc>
-        <w:tc>
-          <w:tcPr>
-            <w:tcW w:type="dxa" w:w="1584"/>
-            <w:vAlign w:val="center"/>
-            <w:tcMar>
-              <w:top w:w="80" w:type="dxa"/>
-              <w:start w:w="120" w:type="dxa"/>
-              <w:bottom w:w="80" w:type="dxa"/>
-              <w:end w:w="120" w:type="dxa"/>
-            </w:tcMar>
-          </w:tcPr>
-          <w:p>
-            <w:pPr>
-              <w:spacing w:after="0" w:line="252" w:lineRule="auto"/>
-            </w:pPr>
-            <w:r>
-              <w:rPr>
-                <w:rFonts w:ascii="Calibri" w:hAnsi="Calibri"/>
-                <w:sz w:val="18"/>
-              </w:rPr>
-              <w:t>Kristian</w:t>
-            </w:r>
-          </w:p>
-        </w:tc>
-        <w:tc>
-          <w:tcPr>
-            <w:tcW w:type="dxa" w:w="5328"/>
-            <w:vAlign w:val="center"/>
-            <w:tcMar>
-              <w:top w:w="80" w:type="dxa"/>
-              <w:start w:w="120" w:type="dxa"/>
-              <w:bottom w:w="80" w:type="dxa"/>
-              <w:end w:w="120" w:type="dxa"/>
-            </w:tcMar>
-          </w:tcPr>
-          <w:p>
-            <w:pPr>
-              <w:spacing w:after="0" w:line="252" w:lineRule="auto"/>
-            </w:pPr>
-            <w:r>
-              <w:rPr>
-                <w:rFonts w:ascii="Calibri" w:hAnsi="Calibri"/>
-                <w:sz w:val="18"/>
-              </w:rPr>
-              <w:t>Metrics, Prometheus, Grafana, and dashboard provisioning.</w:t>
-            </w:r>
-          </w:p>
-        </w:tc>
-      </w:tr>
-      <w:tr>
-        <w:tc>
-          <w:tcPr>
-            <w:tcW w:type="dxa" w:w="648"/>
-            <w:vAlign w:val="center"/>
-            <w:tcMar>
-              <w:top w:w="80" w:type="dxa"/>
-              <w:start w:w="120" w:type="dxa"/>
-              <w:bottom w:w="80" w:type="dxa"/>
-              <w:end w:w="120" w:type="dxa"/>
-            </w:tcMar>
-          </w:tcPr>
-          <w:p>
-            <w:pPr>
-              <w:spacing w:after="0" w:line="252" w:lineRule="auto"/>
-            </w:pPr>
-            <w:r>
-              <w:rPr>
-                <w:rFonts w:ascii="Calibri" w:hAnsi="Calibri"/>
-                <w:sz w:val="18"/>
-              </w:rPr>
-              <w:t>8</w:t>
-            </w:r>
-          </w:p>
-        </w:tc>
-        <w:tc>
-          <w:tcPr>
-            <w:tcW w:type="dxa" w:w="1800"/>
-            <w:vAlign w:val="center"/>
-            <w:tcMar>
-              <w:top w:w="80" w:type="dxa"/>
-              <w:start w:w="120" w:type="dxa"/>
-              <w:bottom w:w="80" w:type="dxa"/>
-              <w:end w:w="120" w:type="dxa"/>
-            </w:tcMar>
-          </w:tcPr>
-          <w:p>
-            <w:pPr>
-              <w:spacing w:after="0" w:line="252" w:lineRule="auto"/>
-            </w:pPr>
-            <w:r>
-              <w:rPr>
-                <w:rFonts w:ascii="Calibri" w:hAnsi="Calibri"/>
-                <w:sz w:val="18"/>
-              </w:rPr>
-              <w:t>Security</w:t>
-            </w:r>
-          </w:p>
-        </w:tc>
-        <w:tc>
-          <w:tcPr>
-            <w:tcW w:type="dxa" w:w="1584"/>
-            <w:vAlign w:val="center"/>
-            <w:tcMar>
-              <w:top w:w="80" w:type="dxa"/>
-              <w:start w:w="120" w:type="dxa"/>
-              <w:bottom w:w="80" w:type="dxa"/>
-              <w:end w:w="120" w:type="dxa"/>
-            </w:tcMar>
-          </w:tcPr>
-          <w:p>
-            <w:pPr>
-              <w:spacing w:after="0" w:line="252" w:lineRule="auto"/>
-            </w:pPr>
-            <w:r>
-              <w:rPr>
-                <w:rFonts w:ascii="Calibri" w:hAnsi="Calibri"/>
-                <w:sz w:val="18"/>
-              </w:rPr>
-              <w:t>Ali</w:t>
-            </w:r>
-          </w:p>
-        </w:tc>
-        <w:tc>
-          <w:tcPr>
-            <w:tcW w:type="dxa" w:w="5328"/>
-            <w:vAlign w:val="center"/>
-            <w:tcMar>
-              <w:top w:w="80" w:type="dxa"/>
-              <w:start w:w="120" w:type="dxa"/>
-              <w:bottom w:w="80" w:type="dxa"/>
-              <w:end w:w="120" w:type="dxa"/>
-            </w:tcMar>
-          </w:tcPr>
-          <w:p>
-            <w:pPr>
-              <w:spacing w:after="0" w:line="252" w:lineRule="auto"/>
-            </w:pPr>
-            <w:r>
-              <w:rPr>
-                <w:rFonts w:ascii="Calibri" w:hAnsi="Calibri"/>
-                <w:sz w:val="18"/>
-              </w:rPr>
-              <w:t>Secret cleanup, Trivy gate, Dependabot, safer network defaults.</w:t>
-            </w:r>
-          </w:p>
-        </w:tc>
-      </w:tr>
-      <w:tr>
-        <w:tc>
-          <w:tcPr>
-            <w:tcW w:type="dxa" w:w="648"/>
-            <w:vAlign w:val="center"/>
-            <w:tcMar>
-              <w:top w:w="80" w:type="dxa"/>
-              <w:start w:w="120" w:type="dxa"/>
-              <w:bottom w:w="80" w:type="dxa"/>
-              <w:end w:w="120" w:type="dxa"/>
-            </w:tcMar>
-          </w:tcPr>
-          <w:p>
-            <w:pPr>
-              <w:spacing w:after="0" w:line="252" w:lineRule="auto"/>
-            </w:pPr>
-            <w:r>
-              <w:rPr>
-                <w:rFonts w:ascii="Calibri" w:hAnsi="Calibri"/>
-                <w:sz w:val="18"/>
-              </w:rPr>
-              <w:t>9</w:t>
-            </w:r>
-          </w:p>
-        </w:tc>
-        <w:tc>
-          <w:tcPr>
-            <w:tcW w:type="dxa" w:w="1800"/>
-            <w:vAlign w:val="center"/>
-            <w:tcMar>
-              <w:top w:w="80" w:type="dxa"/>
-              <w:start w:w="120" w:type="dxa"/>
-              <w:bottom w:w="80" w:type="dxa"/>
-              <w:end w:w="120" w:type="dxa"/>
-            </w:tcMar>
-          </w:tcPr>
-          <w:p>
-            <w:pPr>
-              <w:spacing w:after="0" w:line="252" w:lineRule="auto"/>
-            </w:pPr>
-            <w:r>
-              <w:rPr>
-                <w:rFonts w:ascii="Calibri" w:hAnsi="Calibri"/>
-                <w:sz w:val="18"/>
-              </w:rPr>
-              <w:t>Disaster recovery</w:t>
-            </w:r>
-          </w:p>
-        </w:tc>
-        <w:tc>
-          <w:tcPr>
-            <w:tcW w:type="dxa" w:w="1584"/>
-            <w:vAlign w:val="center"/>
-            <w:tcMar>
-              <w:top w:w="80" w:type="dxa"/>
-              <w:start w:w="120" w:type="dxa"/>
-              <w:bottom w:w="80" w:type="dxa"/>
-              <w:end w:w="120" w:type="dxa"/>
-            </w:tcMar>
-          </w:tcPr>
-          <w:p>
-            <w:pPr>
-              <w:spacing w:after="0" w:line="252" w:lineRule="auto"/>
-            </w:pPr>
-            <w:r>
-              <w:rPr>
-                <w:rFonts w:ascii="Calibri" w:hAnsi="Calibri"/>
-                <w:sz w:val="18"/>
-              </w:rPr>
-              <w:t>Ali</w:t>
-            </w:r>
-          </w:p>
-        </w:tc>
-        <w:tc>
-          <w:tcPr>
-            <w:tcW w:type="dxa" w:w="5328"/>
-            <w:vAlign w:val="center"/>
-            <w:tcMar>
-              <w:top w:w="80" w:type="dxa"/>
-              <w:start w:w="120" w:type="dxa"/>
-              <w:bottom w:w="80" w:type="dxa"/>
-              <w:end w:w="120" w:type="dxa"/>
-            </w:tcMar>
-          </w:tcPr>
-          <w:p>
-            <w:pPr>
-              <w:spacing w:after="0" w:line="252" w:lineRule="auto"/>
-            </w:pPr>
-            <w:r>
-              <w:rPr>
-                <w:rFonts w:ascii="Calibri" w:hAnsi="Calibri"/>
-                <w:sz w:val="18"/>
-              </w:rPr>
-              <w:t>Recovery plan and backup automation; restore exercise pending.</w:t>
-            </w:r>
-          </w:p>
-        </w:tc>
-      </w:tr>
-      <w:tr>
-        <w:tc>
-          <w:tcPr>
-            <w:tcW w:type="dxa" w:w="648"/>
-            <w:vAlign w:val="center"/>
-            <w:tcMar>
-              <w:top w:w="80" w:type="dxa"/>
-              <w:start w:w="120" w:type="dxa"/>
-              <w:bottom w:w="80" w:type="dxa"/>
-              <w:end w:w="120" w:type="dxa"/>
-            </w:tcMar>
-          </w:tcPr>
-          <w:p>
-            <w:pPr>
-              <w:spacing w:after="0" w:line="252" w:lineRule="auto"/>
-            </w:pPr>
-            <w:r>
-              <w:rPr>
-                <w:rFonts w:ascii="Calibri" w:hAnsi="Calibri"/>
-                <w:sz w:val="18"/>
-              </w:rPr>
-              <w:t>10</w:t>
-            </w:r>
-          </w:p>
-        </w:tc>
-        <w:tc>
-          <w:tcPr>
-            <w:tcW w:type="dxa" w:w="1800"/>
-            <w:vAlign w:val="center"/>
-            <w:tcMar>
-              <w:top w:w="80" w:type="dxa"/>
-              <w:start w:w="120" w:type="dxa"/>
-              <w:bottom w:w="80" w:type="dxa"/>
-              <w:end w:w="120" w:type="dxa"/>
-            </w:tcMar>
-          </w:tcPr>
-          <w:p>
-            <w:pPr>
-              <w:spacing w:after="0" w:line="252" w:lineRule="auto"/>
-            </w:pPr>
-            <w:r>
-              <w:rPr>
-                <w:rFonts w:ascii="Calibri" w:hAnsi="Calibri"/>
-                <w:sz w:val="18"/>
-              </w:rPr>
-              <w:t>Documentation</w:t>
-            </w:r>
-          </w:p>
-        </w:tc>
-        <w:tc>
-          <w:tcPr>
-            <w:tcW w:type="dxa" w:w="1584"/>
-            <w:vAlign w:val="center"/>
-            <w:tcMar>
-              <w:top w:w="80" w:type="dxa"/>
-              <w:start w:w="120" w:type="dxa"/>
-              <w:bottom w:w="80" w:type="dxa"/>
-              <w:end w:w="120" w:type="dxa"/>
-            </w:tcMar>
-          </w:tcPr>
-          <w:p>
-            <w:pPr>
-              <w:spacing w:after="0" w:line="252" w:lineRule="auto"/>
-            </w:pPr>
-            <w:r>
-              <w:rPr>
-                <w:rFonts w:ascii="Calibri" w:hAnsi="Calibri"/>
-                <w:sz w:val="18"/>
-              </w:rPr>
-              <w:t>Ali + Hassan</w:t>
-            </w:r>
-          </w:p>
-        </w:tc>
-        <w:tc>
-          <w:tcPr>
-            <w:tcW w:type="dxa" w:w="5328"/>
-            <w:vAlign w:val="center"/>
-            <w:tcMar>
-              <w:top w:w="80" w:type="dxa"/>
-              <w:start w:w="120" w:type="dxa"/>
-              <w:bottom w:w="80" w:type="dxa"/>
-              <w:end w:w="120" w:type="dxa"/>
-            </w:tcMar>
-          </w:tcPr>
-          <w:p>
-            <w:pPr>
-              <w:spacing w:after="0" w:line="252" w:lineRule="auto"/>
-            </w:pPr>
-            <w:r>
-              <w:rPr>
-                <w:rFonts w:ascii="Calibri" w:hAnsi="Calibri"/>
-                <w:sz w:val="18"/>
-              </w:rPr>
-              <w:t>README, guides, diagrams, linked report.</w:t>
-            </w:r>
-          </w:p>
-        </w:tc>
-      </w:tr>
-    </w:tbl>
-    <w:p>
       <w:pPr>
         <w:spacing w:after="0"/>
       </w:pPr>
@@ -2316,7 +1143,7 @@
         <w:pStyle w:val="Heading1"/>
       </w:pPr>
       <w:r>
-        <w:t>3. Application architecture</w:t>
+        <w:t>2. Application architecture</w:t>
       </w:r>
       <w:bookmarkEnd w:id="3"/>
     </w:p>
@@ -3009,7 +1836,7 @@
         <w:pStyle w:val="Heading1"/>
       </w:pPr>
       <w:r>
-        <w:t>4. Docker and environments</w:t>
+        <w:t>3. Docker and environments</w:t>
       </w:r>
       <w:bookmarkEnd w:id="4"/>
     </w:p>
@@ -3439,7 +2266,7 @@
         <w:pStyle w:val="Heading1"/>
       </w:pPr>
       <w:r>
-        <w:t>5. Testing</w:t>
+        <w:t>4. Testing</w:t>
       </w:r>
       <w:bookmarkEnd w:id="5"/>
     </w:p>
@@ -3826,7 +2653,7 @@
         <w:pStyle w:val="Heading1"/>
       </w:pPr>
       <w:r>
-        <w:t>6. CI/CD pipeline - Step 5</w:t>
+        <w:t>5. CI/CD pipeline - Step 5</w:t>
       </w:r>
       <w:bookmarkEnd w:id="6"/>
     </w:p>
@@ -4736,7 +3563,7 @@
         <w:pStyle w:val="Heading1"/>
       </w:pPr>
       <w:r>
-        <w:t>7. Kubernetes - Step 4</w:t>
+        <w:t>6. Kubernetes - Step 4</w:t>
       </w:r>
       <w:bookmarkEnd w:id="7"/>
     </w:p>
@@ -5313,7 +4140,7 @@
         <w:pStyle w:val="Heading1"/>
       </w:pPr>
       <w:r>
-        <w:t>8. Terraform and Proxmox - Step 6</w:t>
+        <w:t>7. Terraform and Proxmox - Step 6</w:t>
       </w:r>
       <w:bookmarkEnd w:id="8"/>
     </w:p>
@@ -5469,7 +4296,7 @@
         <w:pStyle w:val="Heading1"/>
       </w:pPr>
       <w:r>
-        <w:t>9. Monitoring - Step 7</w:t>
+        <w:t>8. Monitoring - Step 7</w:t>
       </w:r>
       <w:bookmarkEnd w:id="9"/>
     </w:p>
@@ -5960,7 +4787,7 @@
         <w:pStyle w:val="Heading1"/>
       </w:pPr>
       <w:r>
-        <w:t>10. Security and DevSecOps - Step 8</w:t>
+        <w:t>9. Security and DevSecOps - Step 8</w:t>
       </w:r>
       <w:bookmarkEnd w:id="10"/>
     </w:p>
@@ -6580,7 +5407,7 @@
         <w:pStyle w:val="Heading1"/>
       </w:pPr>
       <w:r>
-        <w:t>11. Disaster recovery - Step 9</w:t>
+        <w:t>10. Disaster recovery - Step 9</w:t>
       </w:r>
       <w:bookmarkEnd w:id="11"/>
     </w:p>
@@ -7076,7 +5903,7 @@
         <w:pStyle w:val="Heading1"/>
       </w:pPr>
       <w:r>
-        <w:t>12. Setup and operations</w:t>
+        <w:t>11. Setup and operations</w:t>
       </w:r>
       <w:bookmarkEnd w:id="12"/>
     </w:p>
@@ -7086,7 +5913,7 @@
         <w:pStyle w:val="Heading2"/>
       </w:pPr>
       <w:r>
-        <w:t>12.1 Docker development</w:t>
+        <w:t>11.1 Docker development</w:t>
       </w:r>
       <w:bookmarkEnd w:id="13"/>
     </w:p>
@@ -7171,7 +5998,7 @@
         <w:pStyle w:val="Heading2"/>
       </w:pPr>
       <w:r>
-        <w:t>12.2 Kubernetes</w:t>
+        <w:t>11.2 Kubernetes</w:t>
       </w:r>
       <w:bookmarkEnd w:id="14"/>
     </w:p>
@@ -7272,7 +6099,7 @@
         <w:pStyle w:val="Heading2"/>
       </w:pPr>
       <w:r>
-        <w:t>12.3 Terraform on Proxmox</w:t>
+        <w:t>11.3 Terraform on Proxmox</w:t>
       </w:r>
       <w:bookmarkEnd w:id="15"/>
     </w:p>
@@ -7306,6 +6133,58 @@
           <w:t>http://51.158.200.169:8000</w:t>
         </w:r>
       </w:hyperlink>
+    </w:p>
+    <w:p>
+      <w:pPr>
+        <w:jc w:val="center"/>
+        <w:keepNext/>
+      </w:pPr>
+      <w:r>
+        <w:drawing>
+          <wp:inline xmlns:a="http://schemas.openxmlformats.org/drawingml/2006/main" xmlns:pic="http://schemas.openxmlformats.org/drawingml/2006/picture">
+            <wp:extent cx="5806440" cy="3629025"/>
+            <wp:docPr id="5" name="Picture 5" title="Live DST Airlines dashboard on Proxmox" descr="Live DST Airlines overview dashboard hosted on Proxmox, showing API LIVE status, flight KPIs, filters, monthly delay trends, weekday delays, a departure-delay histogram, and the most delayed routes."/>
+            <wp:cNvGraphicFramePr>
+              <a:graphicFrameLocks noChangeAspect="1"/>
+            </wp:cNvGraphicFramePr>
+            <a:graphic>
+              <a:graphicData uri="http://schemas.openxmlformats.org/drawingml/2006/picture">
+                <pic:pic>
+                  <pic:nvPicPr>
+                    <pic:cNvPr id="0" name="page-2026-07-31T07-54-21-178Z.png"/>
+                    <pic:cNvPicPr/>
+                  </pic:nvPicPr>
+                  <pic:blipFill>
+                    <a:blip r:embed="rId17"/>
+                    <a:stretch>
+                      <a:fillRect/>
+                    </a:stretch>
+                  </pic:blipFill>
+                  <pic:spPr>
+                    <a:xfrm>
+                      <a:off x="0" y="0"/>
+                      <a:ext cx="5806440" cy="3629025"/>
+                    </a:xfrm>
+                    <a:prstGeom prst="rect"/>
+                  </pic:spPr>
+                </pic:pic>
+              </a:graphicData>
+            </a:graphic>
+          </wp:inline>
+        </w:drawing>
+      </w:r>
+    </w:p>
+    <w:p>
+      <w:pPr>
+        <w:spacing w:after="160"/>
+        <w:jc w:val="center"/>
+      </w:pPr>
+      <w:r>
+        <w:rPr>
+          <w:i/>
+        </w:rPr>
+        <w:t>Figure 5. Live Proxmox-hosted DST Airlines dashboard, verified 31 July 2026.</w:t>
+      </w:r>
     </w:p>
     <w:p>
       <w:pPr>
@@ -7394,629 +6273,16 @@
         <w:pStyle w:val="Heading1"/>
       </w:pPr>
       <w:r>
-        <w:t>13. Remaining actions</w:t>
+        <w:t>12. Next steps</w:t>
       </w:r>
       <w:bookmarkEnd w:id="16"/>
     </w:p>
-    <w:tbl>
-      <w:tblPr>
-        <w:tblStyle w:val="TableGrid"/>
-        <w:tblW w:type="dxa" w:w="9360"/>
-        <w:jc w:val="center"/>
-        <w:tblLayout w:type="fixed"/>
-        <w:tblLook w:firstColumn="1" w:firstRow="1" w:lastColumn="0" w:lastRow="0" w:noHBand="0" w:noVBand="1" w:val="04A0"/>
-        <w:tblInd w:w="120" w:type="dxa"/>
-      </w:tblPr>
-      <w:tblGrid>
-        <w:gridCol w:w="3120"/>
-        <w:gridCol w:w="3120"/>
-        <w:gridCol w:w="3120"/>
-      </w:tblGrid>
-      <w:tr>
-        <w:trPr>
-          <w:tblHeader w:val="true"/>
-        </w:trPr>
-        <w:tc>
-          <w:tcPr>
-            <w:tcW w:type="dxa" w:w="1008"/>
-            <w:vAlign w:val="center"/>
-            <w:tcMar>
-              <w:top w:w="80" w:type="dxa"/>
-              <w:start w:w="120" w:type="dxa"/>
-              <w:bottom w:w="80" w:type="dxa"/>
-              <w:end w:w="120" w:type="dxa"/>
-            </w:tcMar>
-            <w:shd w:fill="DBEAFE"/>
-          </w:tcPr>
-          <w:p>
-            <w:pPr>
-              <w:spacing w:after="0" w:line="252" w:lineRule="auto"/>
-            </w:pPr>
-            <w:r>
-              <w:rPr>
-                <w:rFonts w:ascii="Calibri" w:hAnsi="Calibri"/>
-                <w:b/>
-                <w:color w:val="0F172A"/>
-                <w:sz w:val="18"/>
-              </w:rPr>
-              <w:t>Priority</w:t>
-            </w:r>
-          </w:p>
-        </w:tc>
-        <w:tc>
-          <w:tcPr>
-            <w:tcW w:type="dxa" w:w="6696"/>
-            <w:vAlign w:val="center"/>
-            <w:tcMar>
-              <w:top w:w="80" w:type="dxa"/>
-              <w:start w:w="120" w:type="dxa"/>
-              <w:bottom w:w="80" w:type="dxa"/>
-              <w:end w:w="120" w:type="dxa"/>
-            </w:tcMar>
-            <w:shd w:fill="DBEAFE"/>
-          </w:tcPr>
-          <w:p>
-            <w:pPr>
-              <w:spacing w:after="0" w:line="252" w:lineRule="auto"/>
-            </w:pPr>
-            <w:r>
-              <w:rPr>
-                <w:rFonts w:ascii="Calibri" w:hAnsi="Calibri"/>
-                <w:b/>
-                <w:color w:val="0F172A"/>
-                <w:sz w:val="18"/>
-              </w:rPr>
-              <w:t>Action</w:t>
-            </w:r>
-          </w:p>
-        </w:tc>
-        <w:tc>
-          <w:tcPr>
-            <w:tcW w:type="dxa" w:w="1656"/>
-            <w:vAlign w:val="center"/>
-            <w:tcMar>
-              <w:top w:w="80" w:type="dxa"/>
-              <w:start w:w="120" w:type="dxa"/>
-              <w:bottom w:w="80" w:type="dxa"/>
-              <w:end w:w="120" w:type="dxa"/>
-            </w:tcMar>
-            <w:shd w:fill="DBEAFE"/>
-          </w:tcPr>
-          <w:p>
-            <w:pPr>
-              <w:spacing w:after="0" w:line="252" w:lineRule="auto"/>
-            </w:pPr>
-            <w:r>
-              <w:rPr>
-                <w:rFonts w:ascii="Calibri" w:hAnsi="Calibri"/>
-                <w:b/>
-                <w:color w:val="0F172A"/>
-                <w:sz w:val="18"/>
-              </w:rPr>
-              <w:t>Suggested owner</w:t>
-            </w:r>
-          </w:p>
-        </w:tc>
-      </w:tr>
-      <w:tr>
-        <w:tc>
-          <w:tcPr>
-            <w:tcW w:type="dxa" w:w="1008"/>
-            <w:vAlign w:val="center"/>
-            <w:tcMar>
-              <w:top w:w="80" w:type="dxa"/>
-              <w:start w:w="120" w:type="dxa"/>
-              <w:bottom w:w="80" w:type="dxa"/>
-              <w:end w:w="120" w:type="dxa"/>
-            </w:tcMar>
-          </w:tcPr>
-          <w:p>
-            <w:pPr>
-              <w:spacing w:after="0" w:line="252" w:lineRule="auto"/>
-            </w:pPr>
-            <w:r>
-              <w:rPr>
-                <w:rFonts w:ascii="Calibri" w:hAnsi="Calibri"/>
-                <w:sz w:val="18"/>
-              </w:rPr>
-              <w:t>P0</w:t>
-            </w:r>
-          </w:p>
-        </w:tc>
-        <w:tc>
-          <w:tcPr>
-            <w:tcW w:type="dxa" w:w="6696"/>
-            <w:vAlign w:val="center"/>
-            <w:tcMar>
-              <w:top w:w="80" w:type="dxa"/>
-              <w:start w:w="120" w:type="dxa"/>
-              <w:bottom w:w="80" w:type="dxa"/>
-              <w:end w:w="120" w:type="dxa"/>
-            </w:tcMar>
-          </w:tcPr>
-          <w:p>
-            <w:pPr>
-              <w:spacing w:after="0" w:line="252" w:lineRule="auto"/>
-            </w:pPr>
-            <w:r>
-              <w:rPr>
-                <w:rFonts w:ascii="Calibri" w:hAnsi="Calibri"/>
-                <w:sz w:val="18"/>
-              </w:rPr>
-              <w:t>Replace demo credentials with unique protected production values.</w:t>
-            </w:r>
-          </w:p>
-        </w:tc>
-        <w:tc>
-          <w:tcPr>
-            <w:tcW w:type="dxa" w:w="1656"/>
-            <w:vAlign w:val="center"/>
-            <w:tcMar>
-              <w:top w:w="80" w:type="dxa"/>
-              <w:start w:w="120" w:type="dxa"/>
-              <w:bottom w:w="80" w:type="dxa"/>
-              <w:end w:w="120" w:type="dxa"/>
-            </w:tcMar>
-          </w:tcPr>
-          <w:p>
-            <w:pPr>
-              <w:spacing w:after="0" w:line="252" w:lineRule="auto"/>
-            </w:pPr>
-            <w:r>
-              <w:rPr>
-                <w:rFonts w:ascii="Calibri" w:hAnsi="Calibri"/>
-                <w:sz w:val="18"/>
-              </w:rPr>
-              <w:t>Ali + Hassan</w:t>
-            </w:r>
-          </w:p>
-        </w:tc>
-      </w:tr>
-      <w:tr>
-        <w:tc>
-          <w:tcPr>
-            <w:tcW w:type="dxa" w:w="1008"/>
-            <w:vAlign w:val="center"/>
-            <w:tcMar>
-              <w:top w:w="80" w:type="dxa"/>
-              <w:start w:w="120" w:type="dxa"/>
-              <w:bottom w:w="80" w:type="dxa"/>
-              <w:end w:w="120" w:type="dxa"/>
-            </w:tcMar>
-          </w:tcPr>
-          <w:p>
-            <w:pPr>
-              <w:spacing w:after="0" w:line="252" w:lineRule="auto"/>
-            </w:pPr>
-            <w:r>
-              <w:rPr>
-                <w:rFonts w:ascii="Calibri" w:hAnsi="Calibri"/>
-                <w:sz w:val="18"/>
-              </w:rPr>
-              <w:t>P0</w:t>
-            </w:r>
-          </w:p>
-        </w:tc>
-        <w:tc>
-          <w:tcPr>
-            <w:tcW w:type="dxa" w:w="6696"/>
-            <w:vAlign w:val="center"/>
-            <w:tcMar>
-              <w:top w:w="80" w:type="dxa"/>
-              <w:start w:w="120" w:type="dxa"/>
-              <w:bottom w:w="80" w:type="dxa"/>
-              <w:end w:w="120" w:type="dxa"/>
-            </w:tcMar>
-          </w:tcPr>
-          <w:p>
-            <w:pPr>
-              <w:spacing w:after="0" w:line="252" w:lineRule="auto"/>
-            </w:pPr>
-            <w:r>
-              <w:rPr>
-                <w:rFonts w:ascii="Calibri" w:hAnsi="Calibri"/>
-                <w:sz w:val="18"/>
-              </w:rPr>
-              <w:t>Verify the former Docker TCP endpoint is disabled and review host activity.</w:t>
-            </w:r>
-          </w:p>
-        </w:tc>
-        <w:tc>
-          <w:tcPr>
-            <w:tcW w:type="dxa" w:w="1656"/>
-            <w:vAlign w:val="center"/>
-            <w:tcMar>
-              <w:top w:w="80" w:type="dxa"/>
-              <w:start w:w="120" w:type="dxa"/>
-              <w:bottom w:w="80" w:type="dxa"/>
-              <w:end w:w="120" w:type="dxa"/>
-            </w:tcMar>
-          </w:tcPr>
-          <w:p>
-            <w:pPr>
-              <w:spacing w:after="0" w:line="252" w:lineRule="auto"/>
-            </w:pPr>
-            <w:r>
-              <w:rPr>
-                <w:rFonts w:ascii="Calibri" w:hAnsi="Calibri"/>
-                <w:sz w:val="18"/>
-              </w:rPr>
-              <w:t>Ali</w:t>
-            </w:r>
-          </w:p>
-        </w:tc>
-      </w:tr>
-      <w:tr>
-        <w:tc>
-          <w:tcPr>
-            <w:tcW w:type="dxa" w:w="1008"/>
-            <w:vAlign w:val="center"/>
-            <w:tcMar>
-              <w:top w:w="80" w:type="dxa"/>
-              <w:start w:w="120" w:type="dxa"/>
-              <w:bottom w:w="80" w:type="dxa"/>
-              <w:end w:w="120" w:type="dxa"/>
-            </w:tcMar>
-          </w:tcPr>
-          <w:p>
-            <w:pPr>
-              <w:spacing w:after="0" w:line="252" w:lineRule="auto"/>
-            </w:pPr>
-            <w:r>
-              <w:rPr>
-                <w:rFonts w:ascii="Calibri" w:hAnsi="Calibri"/>
-                <w:sz w:val="18"/>
-              </w:rPr>
-              <w:t>P1</w:t>
-            </w:r>
-          </w:p>
-        </w:tc>
-        <w:tc>
-          <w:tcPr>
-            <w:tcW w:type="dxa" w:w="6696"/>
-            <w:vAlign w:val="center"/>
-            <w:tcMar>
-              <w:top w:w="80" w:type="dxa"/>
-              <w:start w:w="120" w:type="dxa"/>
-              <w:bottom w:w="80" w:type="dxa"/>
-              <w:end w:w="120" w:type="dxa"/>
-            </w:tcMar>
-          </w:tcPr>
-          <w:p>
-            <w:pPr>
-              <w:spacing w:after="0" w:line="252" w:lineRule="auto"/>
-            </w:pPr>
-            <w:r>
-              <w:rPr>
-                <w:rFonts w:ascii="Calibri" w:hAnsi="Calibri"/>
-                <w:sz w:val="18"/>
-              </w:rPr>
-              <w:t>Harden the Proxmox demo and define an approved production release target.</w:t>
-            </w:r>
-          </w:p>
-        </w:tc>
-        <w:tc>
-          <w:tcPr>
-            <w:tcW w:type="dxa" w:w="1656"/>
-            <w:vAlign w:val="center"/>
-            <w:tcMar>
-              <w:top w:w="80" w:type="dxa"/>
-              <w:start w:w="120" w:type="dxa"/>
-              <w:bottom w:w="80" w:type="dxa"/>
-              <w:end w:w="120" w:type="dxa"/>
-            </w:tcMar>
-          </w:tcPr>
-          <w:p>
-            <w:pPr>
-              <w:spacing w:after="0" w:line="252" w:lineRule="auto"/>
-            </w:pPr>
-            <w:r>
-              <w:rPr>
-                <w:rFonts w:ascii="Calibri" w:hAnsi="Calibri"/>
-                <w:sz w:val="18"/>
-              </w:rPr>
-              <w:t>Ali + Hassan</w:t>
-            </w:r>
-          </w:p>
-        </w:tc>
-      </w:tr>
-      <w:tr>
-        <w:tc>
-          <w:tcPr>
-            <w:tcW w:type="dxa" w:w="1008"/>
-            <w:vAlign w:val="center"/>
-            <w:tcMar>
-              <w:top w:w="80" w:type="dxa"/>
-              <w:start w:w="120" w:type="dxa"/>
-              <w:bottom w:w="80" w:type="dxa"/>
-              <w:end w:w="120" w:type="dxa"/>
-            </w:tcMar>
-          </w:tcPr>
-          <w:p>
-            <w:pPr>
-              <w:spacing w:after="0" w:line="252" w:lineRule="auto"/>
-            </w:pPr>
-            <w:r>
-              <w:rPr>
-                <w:rFonts w:ascii="Calibri" w:hAnsi="Calibri"/>
-                <w:sz w:val="18"/>
-              </w:rPr>
-              <w:t>P1</w:t>
-            </w:r>
-          </w:p>
-        </w:tc>
-        <w:tc>
-          <w:tcPr>
-            <w:tcW w:type="dxa" w:w="6696"/>
-            <w:vAlign w:val="center"/>
-            <w:tcMar>
-              <w:top w:w="80" w:type="dxa"/>
-              <w:start w:w="120" w:type="dxa"/>
-              <w:bottom w:w="80" w:type="dxa"/>
-              <w:end w:w="120" w:type="dxa"/>
-            </w:tcMar>
-          </w:tcPr>
-          <w:p>
-            <w:pPr>
-              <w:spacing w:after="0" w:line="252" w:lineRule="auto"/>
-            </w:pPr>
-            <w:r>
-              <w:rPr>
-                <w:rFonts w:ascii="Calibri" w:hAnsi="Calibri"/>
-                <w:sz w:val="18"/>
-              </w:rPr>
-              <w:t>Add environment-specific Kubernetes configuration and Ingress/TLS.</w:t>
-            </w:r>
-          </w:p>
-        </w:tc>
-        <w:tc>
-          <w:tcPr>
-            <w:tcW w:type="dxa" w:w="1656"/>
-            <w:vAlign w:val="center"/>
-            <w:tcMar>
-              <w:top w:w="80" w:type="dxa"/>
-              <w:start w:w="120" w:type="dxa"/>
-              <w:bottom w:w="80" w:type="dxa"/>
-              <w:end w:w="120" w:type="dxa"/>
-            </w:tcMar>
-          </w:tcPr>
-          <w:p>
-            <w:pPr>
-              <w:spacing w:after="0" w:line="252" w:lineRule="auto"/>
-            </w:pPr>
-            <w:r>
-              <w:rPr>
-                <w:rFonts w:ascii="Calibri" w:hAnsi="Calibri"/>
-                <w:sz w:val="18"/>
-              </w:rPr>
-              <w:t>Ali</w:t>
-            </w:r>
-          </w:p>
-        </w:tc>
-      </w:tr>
-      <w:tr>
-        <w:tc>
-          <w:tcPr>
-            <w:tcW w:type="dxa" w:w="1008"/>
-            <w:vAlign w:val="center"/>
-            <w:tcMar>
-              <w:top w:w="80" w:type="dxa"/>
-              <w:start w:w="120" w:type="dxa"/>
-              <w:bottom w:w="80" w:type="dxa"/>
-              <w:end w:w="120" w:type="dxa"/>
-            </w:tcMar>
-          </w:tcPr>
-          <w:p>
-            <w:pPr>
-              <w:spacing w:after="0" w:line="252" w:lineRule="auto"/>
-            </w:pPr>
-            <w:r>
-              <w:rPr>
-                <w:rFonts w:ascii="Calibri" w:hAnsi="Calibri"/>
-                <w:sz w:val="18"/>
-              </w:rPr>
-              <w:t>P1</w:t>
-            </w:r>
-          </w:p>
-        </w:tc>
-        <w:tc>
-          <w:tcPr>
-            <w:tcW w:type="dxa" w:w="6696"/>
-            <w:vAlign w:val="center"/>
-            <w:tcMar>
-              <w:top w:w="80" w:type="dxa"/>
-              <w:start w:w="120" w:type="dxa"/>
-              <w:bottom w:w="80" w:type="dxa"/>
-              <w:end w:w="120" w:type="dxa"/>
-            </w:tcMar>
-          </w:tcPr>
-          <w:p>
-            <w:pPr>
-              <w:spacing w:after="0" w:line="252" w:lineRule="auto"/>
-            </w:pPr>
-            <w:r>
-              <w:rPr>
-                <w:rFonts w:ascii="Calibri" w:hAnsi="Calibri"/>
-                <w:sz w:val="18"/>
-              </w:rPr>
-              <w:t>Run and document a complete backup restore exercise.</w:t>
-            </w:r>
-          </w:p>
-        </w:tc>
-        <w:tc>
-          <w:tcPr>
-            <w:tcW w:type="dxa" w:w="1656"/>
-            <w:vAlign w:val="center"/>
-            <w:tcMar>
-              <w:top w:w="80" w:type="dxa"/>
-              <w:start w:w="120" w:type="dxa"/>
-              <w:bottom w:w="80" w:type="dxa"/>
-              <w:end w:w="120" w:type="dxa"/>
-            </w:tcMar>
-          </w:tcPr>
-          <w:p>
-            <w:pPr>
-              <w:spacing w:after="0" w:line="252" w:lineRule="auto"/>
-            </w:pPr>
-            <w:r>
-              <w:rPr>
-                <w:rFonts w:ascii="Calibri" w:hAnsi="Calibri"/>
-                <w:sz w:val="18"/>
-              </w:rPr>
-              <w:t>Ali</w:t>
-            </w:r>
-          </w:p>
-        </w:tc>
-      </w:tr>
-      <w:tr>
-        <w:tc>
-          <w:tcPr>
-            <w:tcW w:type="dxa" w:w="1008"/>
-            <w:vAlign w:val="center"/>
-            <w:tcMar>
-              <w:top w:w="80" w:type="dxa"/>
-              <w:start w:w="120" w:type="dxa"/>
-              <w:bottom w:w="80" w:type="dxa"/>
-              <w:end w:w="120" w:type="dxa"/>
-            </w:tcMar>
-          </w:tcPr>
-          <w:p>
-            <w:pPr>
-              <w:spacing w:after="0" w:line="252" w:lineRule="auto"/>
-            </w:pPr>
-            <w:r>
-              <w:rPr>
-                <w:rFonts w:ascii="Calibri" w:hAnsi="Calibri"/>
-                <w:sz w:val="18"/>
-              </w:rPr>
-              <w:t>P2</w:t>
-            </w:r>
-          </w:p>
-        </w:tc>
-        <w:tc>
-          <w:tcPr>
-            <w:tcW w:type="dxa" w:w="6696"/>
-            <w:vAlign w:val="center"/>
-            <w:tcMar>
-              <w:top w:w="80" w:type="dxa"/>
-              <w:start w:w="120" w:type="dxa"/>
-              <w:bottom w:w="80" w:type="dxa"/>
-              <w:end w:w="120" w:type="dxa"/>
-            </w:tcMar>
-          </w:tcPr>
-          <w:p>
-            <w:pPr>
-              <w:spacing w:after="0" w:line="252" w:lineRule="auto"/>
-            </w:pPr>
-            <w:r>
-              <w:rPr>
-                <w:rFonts w:ascii="Calibri" w:hAnsi="Calibri"/>
-                <w:sz w:val="18"/>
-              </w:rPr>
-              <w:t>Add monitoring alerts, SLOs, and log aggregation.</w:t>
-            </w:r>
-          </w:p>
-        </w:tc>
-        <w:tc>
-          <w:tcPr>
-            <w:tcW w:type="dxa" w:w="1656"/>
-            <w:vAlign w:val="center"/>
-            <w:tcMar>
-              <w:top w:w="80" w:type="dxa"/>
-              <w:start w:w="120" w:type="dxa"/>
-              <w:bottom w:w="80" w:type="dxa"/>
-              <w:end w:w="120" w:type="dxa"/>
-            </w:tcMar>
-          </w:tcPr>
-          <w:p>
-            <w:pPr>
-              <w:spacing w:after="0" w:line="252" w:lineRule="auto"/>
-            </w:pPr>
-            <w:r>
-              <w:rPr>
-                <w:rFonts w:ascii="Calibri" w:hAnsi="Calibri"/>
-                <w:sz w:val="18"/>
-              </w:rPr>
-              <w:t>Kristian</w:t>
-            </w:r>
-          </w:p>
-        </w:tc>
-      </w:tr>
-      <w:tr>
-        <w:tc>
-          <w:tcPr>
-            <w:tcW w:type="dxa" w:w="1008"/>
-            <w:vAlign w:val="center"/>
-            <w:tcMar>
-              <w:top w:w="80" w:type="dxa"/>
-              <w:start w:w="120" w:type="dxa"/>
-              <w:bottom w:w="80" w:type="dxa"/>
-              <w:end w:w="120" w:type="dxa"/>
-            </w:tcMar>
-          </w:tcPr>
-          <w:p>
-            <w:pPr>
-              <w:spacing w:after="0" w:line="252" w:lineRule="auto"/>
-            </w:pPr>
-            <w:r>
-              <w:rPr>
-                <w:rFonts w:ascii="Calibri" w:hAnsi="Calibri"/>
-                <w:sz w:val="18"/>
-              </w:rPr>
-              <w:t>P2</w:t>
-            </w:r>
-          </w:p>
-        </w:tc>
-        <w:tc>
-          <w:tcPr>
-            <w:tcW w:type="dxa" w:w="6696"/>
-            <w:vAlign w:val="center"/>
-            <w:tcMar>
-              <w:top w:w="80" w:type="dxa"/>
-              <w:start w:w="120" w:type="dxa"/>
-              <w:bottom w:w="80" w:type="dxa"/>
-              <w:end w:w="120" w:type="dxa"/>
-            </w:tcMar>
-          </w:tcPr>
-          <w:p>
-            <w:pPr>
-              <w:spacing w:after="0" w:line="252" w:lineRule="auto"/>
-            </w:pPr>
-            <w:r>
-              <w:rPr>
-                <w:rFonts w:ascii="Calibri" w:hAnsi="Calibri"/>
-                <w:sz w:val="18"/>
-              </w:rPr>
-              <w:t>Add browser E2E tests and coverage reporting.</w:t>
-            </w:r>
-          </w:p>
-        </w:tc>
-        <w:tc>
-          <w:tcPr>
-            <w:tcW w:type="dxa" w:w="1656"/>
-            <w:vAlign w:val="center"/>
-            <w:tcMar>
-              <w:top w:w="80" w:type="dxa"/>
-              <w:start w:w="120" w:type="dxa"/>
-              <w:bottom w:w="80" w:type="dxa"/>
-              <w:end w:w="120" w:type="dxa"/>
-            </w:tcMar>
-          </w:tcPr>
-          <w:p>
-            <w:pPr>
-              <w:spacing w:after="0" w:line="252" w:lineRule="auto"/>
-            </w:pPr>
-            <w:r>
-              <w:rPr>
-                <w:rFonts w:ascii="Calibri" w:hAnsi="Calibri"/>
-                <w:sz w:val="18"/>
-              </w:rPr>
-              <w:t>Hassan</w:t>
-            </w:r>
-          </w:p>
-        </w:tc>
-      </w:tr>
-    </w:tbl>
+    <w:p>
+      <w:pPr/>
+      <w:r>
+        <w:t>Next steps are to rotate all classroom/demo credentials, enable HTTPS, review firewall exposure, add protected GitHub production environments with approval controls, deploy monitoring persistently with alerting, pin immutable image digests, and complete a documented backup-and-restore exercise.</w:t>
+      </w:r>
+    </w:p>
     <w:p>
       <w:pPr>
         <w:spacing w:after="0"/>
@@ -8028,11 +6294,14 @@
         <w:pStyle w:val="Heading1"/>
       </w:pPr>
       <w:r>
-        <w:t>14. Conclusion</w:t>
+        <w:t>13. Conclusion</w:t>
       </w:r>
       <w:bookmarkEnd w:id="17"/>
     </w:p>
     <w:p>
+      <w:pPr>
+        <w:keepNext/>
+      </w:pPr>
       <w:r>
         <w:t>The project demonstrates a modern DataOps delivery system with verified CI validation and a persistent Proxmox-hosted demonstration. Step 5 is implemented: tests, Terraform validation, GHCR, Trivy, Kind deployment, and smoke tests pass. Kind proves Kubernetes deployability; Proxmox keeps the dashboard and API continuously reachable.</w:t>
       </w:r>
@@ -8046,6 +6315,7 @@
       <w:bookmarkStart w:id="18" w:name="evidence_map"/>
       <w:pPr>
         <w:pStyle w:val="Heading1"/>
+        <w:pageBreakBefore w:val="0"/>
       </w:pPr>
       <w:r>
         <w:t>Appendix A. Evidence map</w:t>

</xml_diff>

<commit_message>
docs: update project team credits
</commit_message>
<xml_diff>
--- a/DST_Airlines_Documentation.docx
+++ b/DST_Airlines_Documentation.docx
@@ -32,7 +32,7 @@
           <w:color w:val="1D4ED8"/>
           <w:sz w:val="32"/>
         </w:rPr>
-        <w:t>Implementation, Architecture, CI/CD, and Operational Readiness Report</w:t>
+        <w:t>DataOps Project | June 2026 Batch | LIORA</w:t>
       </w:r>
     </w:p>
     <w:p>
@@ -45,7 +45,20 @@
           <w:b/>
           <w:sz w:val="24"/>
         </w:rPr>
-        <w:t>DataScientest LIORA DataOps Bootcamp | Group 1</w:t>
+        <w:t>Project team: Hassan Salam Banayeem | Ali Doghan</w:t>
+      </w:r>
+    </w:p>
+    <w:p>
+      <w:pPr>
+        <w:spacing w:after="120"/>
+        <w:jc w:val="center"/>
+      </w:pPr>
+      <w:r>
+        <w:rPr>
+          <w:b/>
+          <w:sz w:val="24"/>
+        </w:rPr>
+        <w:t>Monitoring contributor: Kristian</w:t>
       </w:r>
     </w:p>
     <w:p>

</xml_diff>